<commit_message>
Updated and added notes
</commit_message>
<xml_diff>
--- a/note/Kafka.docx
+++ b/note/Kafka.docx
@@ -174,7 +174,7 @@
                     <pic:cNvPicPr preferRelativeResize="0"/>
                   </pic:nvPicPr>
                   <pic:blipFill>
-                    <a:blip r:embed="rId6"/>
+                    <a:blip r:embed="rId7"/>
                     <a:srcRect b="0" l="0" r="0" t="0"/>
                     <a:stretch>
                       <a:fillRect/>
@@ -184,6 +184,62 @@
                     <a:xfrm>
                       <a:off x="0" y="0"/>
                       <a:ext cx="5943600" cy="3835400"/>
+                    </a:xfrm>
+                    <a:prstGeom prst="rect"/>
+                    <a:ln/>
+                  </pic:spPr>
+                </pic:pic>
+              </a:graphicData>
+            </a:graphic>
+          </wp:inline>
+        </w:drawing>
+      </w:r>
+      <w:r>
+        <w:rPr>
+          <w:rtl w:val="0"/>
+        </w:rPr>
+      </w:r>
+    </w:p>
+    <w:p>
+      <w:pPr>
+        <w:rPr/>
+      </w:pPr>
+      <w:r>
+        <w:rPr>
+          <w:rtl w:val="0"/>
+        </w:rPr>
+        <w:t xml:space="preserve">More detailed diagram below.</w:t>
+      </w:r>
+    </w:p>
+    <w:p>
+      <w:pPr>
+        <w:rPr/>
+      </w:pPr>
+      <w:r>
+        <w:rPr/>
+        <w:drawing>
+          <wp:inline distB="114300" distT="114300" distL="114300" distR="114300">
+            <wp:extent cx="6824663" cy="7762875"/>
+            <wp:effectExtent b="0" l="0" r="0" t="0"/>
+            <wp:docPr id="2" name="image2.png"/>
+            <a:graphic>
+              <a:graphicData uri="http://schemas.openxmlformats.org/drawingml/2006/picture">
+                <pic:pic>
+                  <pic:nvPicPr>
+                    <pic:cNvPr id="0" name="image2.png"/>
+                    <pic:cNvPicPr preferRelativeResize="0"/>
+                  </pic:nvPicPr>
+                  <pic:blipFill>
+                    <a:blip r:embed="rId8"/>
+                    <a:srcRect b="0" l="0" r="0" t="0"/>
+                    <a:stretch>
+                      <a:fillRect/>
+                    </a:stretch>
+                  </pic:blipFill>
+                  <pic:spPr>
+                    <a:xfrm>
+                      <a:off x="0" y="0"/>
+                      <a:ext cx="6824663" cy="7762875"/>
                     </a:xfrm>
                     <a:prstGeom prst="rect"/>
                     <a:ln/>
@@ -977,7 +1033,7 @@
       <w:pPr>
         <w:numPr>
           <w:ilvl w:val="0"/>
-          <w:numId w:val="2"/>
+          <w:numId w:val="6"/>
         </w:numPr>
         <w:ind w:left="720" w:hanging="360"/>
         <w:rPr>
@@ -986,16 +1042,29 @@
       </w:pPr>
       <w:r>
         <w:rPr>
-          <w:rtl w:val="0"/>
-        </w:rPr>
-        <w:t xml:space="preserve">Event: An Event (also frequently called a Record or Message) is the smallest unit of data. It represents a "fact" that has happened in our system at a specific point in time. From a technical perspective, an event is a Key-Value pair accompanied by a Timestamp and Metadata.</w:t>
-      </w:r>
-    </w:p>
-    <w:p>
-      <w:pPr>
-        <w:numPr>
-          <w:ilvl w:val="0"/>
-          <w:numId w:val="2"/>
+          <w:b w:val="1"/>
+          <w:bCs w:val="1"/>
+          <w:rtl w:val="0"/>
+        </w:rPr>
+        <w:t xml:space="preserve">Event</w:t>
+      </w:r>
+      <w:r>
+        <w:rPr>
+          <w:rtl w:val="0"/>
+        </w:rPr>
+        <w:t xml:space="preserve">: An Event (also frequently called a Record or Message) is the smallest unit of data stored in Kafka. It represents a "fact" that has happened in our system at a specific point in time. From a technical perspective, an event is a Key-Value pair accompanied by a Timestamp and Metadata.</w:t>
+      </w:r>
+      <w:r>
+        <w:rPr>
+          <w:rtl w:val="0"/>
+        </w:rPr>
+      </w:r>
+    </w:p>
+    <w:p>
+      <w:pPr>
+        <w:numPr>
+          <w:ilvl w:val="0"/>
+          <w:numId w:val="6"/>
         </w:numPr>
         <w:ind w:left="720" w:hanging="360"/>
         <w:rPr>
@@ -1004,31 +1073,53 @@
       </w:pPr>
       <w:r>
         <w:rPr>
-          <w:rtl w:val="0"/>
-        </w:rPr>
-        <w:t xml:space="preserve">Cluster: A group of Brokers working together is called a Cluster. A cluster provides high availability; if one broker fails, others take over.</w:t>
-      </w:r>
-    </w:p>
-    <w:p>
-      <w:pPr>
-        <w:numPr>
-          <w:ilvl w:val="0"/>
-          <w:numId w:val="2"/>
-        </w:numPr>
-        <w:ind w:left="720" w:hanging="360"/>
-      </w:pPr>
-      <w:r>
-        <w:rPr>
-          <w:rtl w:val="0"/>
-        </w:rPr>
-        <w:t xml:space="preserve">Broker: An individual server within the Kafka infrastructure. Its job is to receive messages from producers, store them on disk, and serve them to consumers.</w:t>
-      </w:r>
-    </w:p>
-    <w:p>
-      <w:pPr>
-        <w:numPr>
-          <w:ilvl w:val="0"/>
-          <w:numId w:val="2"/>
+          <w:b w:val="1"/>
+          <w:bCs w:val="1"/>
+          <w:rtl w:val="0"/>
+        </w:rPr>
+        <w:t xml:space="preserve">Cluster</w:t>
+      </w:r>
+      <w:r>
+        <w:rPr>
+          <w:rtl w:val="0"/>
+        </w:rPr>
+        <w:t xml:space="preserve">: A group of Brokers working together is called a Cluster. A cluster provides high availability; if one broker fails, others take over.</w:t>
+      </w:r>
+      <w:r>
+        <w:rPr>
+          <w:rtl w:val="0"/>
+        </w:rPr>
+      </w:r>
+    </w:p>
+    <w:p>
+      <w:pPr>
+        <w:numPr>
+          <w:ilvl w:val="0"/>
+          <w:numId w:val="6"/>
+        </w:numPr>
+        <w:ind w:left="720" w:hanging="360"/>
+        <w:rPr/>
+      </w:pPr>
+      <w:r>
+        <w:rPr>
+          <w:b w:val="1"/>
+          <w:bCs w:val="1"/>
+          <w:rtl w:val="0"/>
+        </w:rPr>
+        <w:t xml:space="preserve">Broker</w:t>
+      </w:r>
+      <w:r>
+        <w:rPr>
+          <w:rtl w:val="0"/>
+        </w:rPr>
+        <w:t xml:space="preserve">: An individual server within the Kafka infrastructure. Its job is to receive messages from producers, store them on disk, and serve them to consumers. The leader broker takes the responsibility of replication of data to other brokers.</w:t>
+      </w:r>
+    </w:p>
+    <w:p>
+      <w:pPr>
+        <w:numPr>
+          <w:ilvl w:val="0"/>
+          <w:numId w:val="6"/>
         </w:numPr>
         <w:ind w:left="720" w:hanging="360"/>
         <w:rPr>
@@ -1037,9 +1128,17 @@
       </w:pPr>
       <w:r>
         <w:rPr>
-          <w:rtl w:val="0"/>
-        </w:rPr>
-        <w:t xml:space="preserve">Topic: A Topic is a </w:t>
+          <w:b w:val="1"/>
+          <w:bCs w:val="1"/>
+          <w:rtl w:val="0"/>
+        </w:rPr>
+        <w:t xml:space="preserve">Topic</w:t>
+      </w:r>
+      <w:r>
+        <w:rPr>
+          <w:rtl w:val="0"/>
+        </w:rPr>
+        <w:t xml:space="preserve">: A Topic is a </w:t>
       </w:r>
       <w:r>
         <w:rPr>
@@ -1055,12 +1154,17 @@
         </w:rPr>
         <w:t xml:space="preserve"> category to which events belong to. If we think of Kafka as a database, a topic is similar to a table. If you think of it as a filesystem, a topic is like a folder, where individual events are the files. Physically, a topic is divided into Partitions. Partitions allow a single topic to be spread across multiple brokers. This enables parallelism, as different consumers in a group can read from different partitions at the same time. Consumers don’t read “topic”, they read partitions.</w:t>
       </w:r>
-    </w:p>
-    <w:p>
-      <w:pPr>
-        <w:numPr>
-          <w:ilvl w:val="0"/>
-          <w:numId w:val="2"/>
+      <w:r>
+        <w:rPr>
+          <w:rtl w:val="0"/>
+        </w:rPr>
+      </w:r>
+    </w:p>
+    <w:p>
+      <w:pPr>
+        <w:numPr>
+          <w:ilvl w:val="0"/>
+          <w:numId w:val="6"/>
         </w:numPr>
         <w:ind w:left="720" w:hanging="360"/>
         <w:rPr>
@@ -1069,16 +1173,42 @@
       </w:pPr>
       <w:r>
         <w:rPr>
-          <w:rtl w:val="0"/>
-        </w:rPr>
-        <w:t xml:space="preserve">Partition: The physical division of a Topic. Partition is the actual log file on the disk where data is stored.</w:t>
-      </w:r>
-    </w:p>
-    <w:p>
-      <w:pPr>
-        <w:numPr>
-          <w:ilvl w:val="0"/>
-          <w:numId w:val="2"/>
+          <w:b w:val="1"/>
+          <w:bCs w:val="1"/>
+          <w:rtl w:val="0"/>
+        </w:rPr>
+        <w:t xml:space="preserve">Partition</w:t>
+      </w:r>
+      <w:sdt>
+        <w:sdtPr>
+          <w:id w:val="144416885"/>
+          <w:tag w:val="goog_rdk_0"/>
+        </w:sdtPr>
+        <w:sdtContent>
+          <w:r>
+            <w:rPr>
+              <w:rFonts w:ascii="Arial Unicode MS" w:cs="Arial Unicode MS" w:eastAsia="Arial Unicode MS" w:hAnsi="Arial Unicode MS"/>
+              <w:rtl w:val="0"/>
+            </w:rPr>
+            <w:t xml:space="preserve">: The physical division of a Topic. Partition is the directory in which the actual log files are stored on the disk where data/messages are stored. When a partition is created, Kafka creates copies of the partition (called Replicas) and intentionally scatters them across different physical brokers in the cluster. This ensures that if one broker goes down, another broker holding a copy of that partition can take over. </w:t>
+            <w:br w:type="textWrapping"/>
+            <w:t xml:space="preserve">The logs inside the partition are stored in multiple segments. Each segment has 3 type of files → .log file, .index file, .timeIndex file.</w:t>
+            <w:br w:type="textWrapping"/>
+            <w:t xml:space="preserve">Apart from that each partition has leader-epoch-checkpoint and partition.metadata files. These 2 files are the same for all segments inside a partition.</w:t>
+          </w:r>
+        </w:sdtContent>
+      </w:sdt>
+      <w:r>
+        <w:rPr>
+          <w:rtl w:val="0"/>
+        </w:rPr>
+      </w:r>
+    </w:p>
+    <w:p>
+      <w:pPr>
+        <w:numPr>
+          <w:ilvl w:val="0"/>
+          <w:numId w:val="6"/>
         </w:numPr>
         <w:ind w:left="720" w:hanging="360"/>
         <w:rPr>
@@ -1087,16 +1217,29 @@
       </w:pPr>
       <w:r>
         <w:rPr>
-          <w:rtl w:val="0"/>
-        </w:rPr>
-        <w:t xml:space="preserve">Consumer Group: A Consumer Group is a collection of consumers that work together to consume data from one or more Kafka topics. A partition can be accessed by only one consumer in a consumer group, but a single consumer (within a consumer group) can access from multiple partitions. Also, a single partition can be accessed by multiple consumers which are from different consumer groups. A consumer can not exist without a consumer group.</w:t>
-      </w:r>
-    </w:p>
-    <w:p>
-      <w:pPr>
-        <w:numPr>
-          <w:ilvl w:val="0"/>
-          <w:numId w:val="2"/>
+          <w:b w:val="1"/>
+          <w:bCs w:val="1"/>
+          <w:rtl w:val="0"/>
+        </w:rPr>
+        <w:t xml:space="preserve">Consumer Group</w:t>
+      </w:r>
+      <w:r>
+        <w:rPr>
+          <w:rtl w:val="0"/>
+        </w:rPr>
+        <w:t xml:space="preserve">: A Consumer Group is a collection of consumers that work together to consume data from one or more Kafka topics. A partition can be accessed by only one consumer in a consumer group, but a single consumer (within a consumer group) can access from multiple partitions. Also, a single partition can be accessed by multiple consumers which are from different consumer groups. A consumer can not exist without a consumer group. Every consumer group has a group coordinator.</w:t>
+      </w:r>
+      <w:r>
+        <w:rPr>
+          <w:rtl w:val="0"/>
+        </w:rPr>
+      </w:r>
+    </w:p>
+    <w:p>
+      <w:pPr>
+        <w:numPr>
+          <w:ilvl w:val="0"/>
+          <w:numId w:val="6"/>
         </w:numPr>
         <w:ind w:left="720" w:hanging="360"/>
         <w:rPr>
@@ -1105,9 +1248,17 @@
       </w:pPr>
       <w:r>
         <w:rPr>
-          <w:rtl w:val="0"/>
-        </w:rPr>
-        <w:t xml:space="preserve">Offset: It is a unique sequential ID assigned to each message within a partition. It represents the position of the message and is used by consumers to track their reading progress. Offset is unique only within the partition. Consumers commit offsets so they can resume from the last processed message. Kafka maintains a special internal system topic called </w:t>
+          <w:b w:val="1"/>
+          <w:bCs w:val="1"/>
+          <w:rtl w:val="0"/>
+        </w:rPr>
+        <w:t xml:space="preserve">Offset</w:t>
+      </w:r>
+      <w:r>
+        <w:rPr>
+          <w:rtl w:val="0"/>
+        </w:rPr>
+        <w:t xml:space="preserve">: It is a unique sequential ID assigned to each message within a partition. It represents the position of the message and is used by consumers to track their reading progress. Offset is unique only within the partition. Consumers commit offsets so they can resume from the last processed message. Kafka maintains a special internal system topic called </w:t>
       </w:r>
       <w:r>
         <w:rPr>
@@ -1121,40 +1272,380 @@
         <w:rPr>
           <w:rtl w:val="0"/>
         </w:rPr>
-        <w:t xml:space="preserve">. which maintains the list of offset for each consumer. When a consumer "commits" its progress, it sends a message to this topic, effectively saving all the offset related to the consumers in this topic. In other words, offset is like a bookmark which says that a consumer has processed all the events before this offset. The kafka broker (leader of partition) assign the offset.</w:t>
-      </w:r>
-    </w:p>
-    <w:p>
-      <w:pPr>
-        <w:rPr/>
-      </w:pPr>
-      <w:r>
-        <w:rPr>
-          <w:rtl w:val="0"/>
-        </w:rPr>
-      </w:r>
-    </w:p>
-    <w:p>
-      <w:pPr>
-        <w:rPr>
-          <w:b w:val="1"/>
-          <w:bCs w:val="1"/>
-        </w:rPr>
-      </w:pPr>
-      <w:r>
-        <w:br w:type="page"/>
-      </w:r>
-      <w:r>
-        <w:rPr>
-          <w:rtl w:val="0"/>
-        </w:rPr>
-      </w:r>
-    </w:p>
-    <w:p>
-      <w:pPr>
-        <w:rPr>
-          <w:b w:val="1"/>
-          <w:bCs w:val="1"/>
+        <w:t xml:space="preserve">. which maintains the list of offset for each consumer. When a consumer "commits" its progress, it sends a message to this topic, effectively saving all the offset related to the consumers in this topic. In other words, offset is like a bookmark which says that a consumer has processed all the events before this offset. The kafka broker (leader of partition) assigns the offset.</w:t>
+      </w:r>
+    </w:p>
+    <w:p>
+      <w:pPr>
+        <w:numPr>
+          <w:ilvl w:val="0"/>
+          <w:numId w:val="6"/>
+        </w:numPr>
+        <w:ind w:left="720" w:hanging="360"/>
+        <w:rPr>
+          <w:u w:val="none"/>
+        </w:rPr>
+      </w:pPr>
+      <w:r>
+        <w:rPr>
+          <w:b w:val="1"/>
+          <w:bCs w:val="1"/>
+          <w:rtl w:val="0"/>
+        </w:rPr>
+        <w:t xml:space="preserve">Kafka Connect</w:t>
+      </w:r>
+      <w:r>
+        <w:rPr>
+          <w:rtl w:val="0"/>
+        </w:rPr>
+        <w:t xml:space="preserve">: It is a framework for integrating Kafka with external systems.</w:t>
+      </w:r>
+    </w:p>
+    <w:p>
+      <w:pPr>
+        <w:numPr>
+          <w:ilvl w:val="0"/>
+          <w:numId w:val="6"/>
+        </w:numPr>
+        <w:ind w:left="720" w:hanging="360"/>
+        <w:rPr>
+          <w:u w:val="none"/>
+        </w:rPr>
+      </w:pPr>
+      <w:r>
+        <w:rPr>
+          <w:b w:val="1"/>
+          <w:bCs w:val="1"/>
+          <w:rtl w:val="0"/>
+        </w:rPr>
+        <w:t xml:space="preserve">Kafka Streams</w:t>
+      </w:r>
+      <w:r>
+        <w:rPr>
+          <w:rtl w:val="0"/>
+        </w:rPr>
+        <w:t xml:space="preserve">: It is a stream processing library that allows the developers to build real-time applications and microservices using Kafka as underlying data infrastructure.</w:t>
+      </w:r>
+    </w:p>
+    <w:p>
+      <w:pPr>
+        <w:ind w:left="0" w:firstLine="0"/>
+        <w:rPr/>
+      </w:pPr>
+      <w:r>
+        <w:rPr>
+          <w:rtl w:val="0"/>
+        </w:rPr>
+      </w:r>
+    </w:p>
+    <w:p>
+      <w:pPr>
+        <w:ind w:left="0" w:firstLine="0"/>
+        <w:rPr/>
+      </w:pPr>
+      <w:r>
+        <w:rPr>
+          <w:rtl w:val="0"/>
+        </w:rPr>
+        <w:t xml:space="preserve">Note: </w:t>
+      </w:r>
+      <w:r>
+        <w:rPr>
+          <w:b w:val="1"/>
+          <w:bCs w:val="1"/>
+          <w:rtl w:val="0"/>
+        </w:rPr>
+        <w:t xml:space="preserve">ephemeral node</w:t>
+      </w:r>
+      <w:r>
+        <w:rPr>
+          <w:rtl w:val="0"/>
+        </w:rPr>
+        <w:t xml:space="preserve"> is a temporary data registry that exists only as long as the client that created it is alive and connected.</w:t>
+      </w:r>
+    </w:p>
+    <w:p>
+      <w:pPr>
+        <w:ind w:left="720" w:firstLine="0"/>
+        <w:rPr/>
+      </w:pPr>
+      <w:r>
+        <w:rPr>
+          <w:rtl w:val="0"/>
+        </w:rPr>
+      </w:r>
+    </w:p>
+    <w:p>
+      <w:pPr>
+        <w:rPr>
+          <w:b w:val="1"/>
+          <w:bCs w:val="1"/>
+        </w:rPr>
+      </w:pPr>
+      <w:r>
+        <w:rPr>
+          <w:rtl w:val="0"/>
+        </w:rPr>
+      </w:r>
+    </w:p>
+    <w:p>
+      <w:pPr>
+        <w:numPr>
+          <w:ilvl w:val="0"/>
+          <w:numId w:val="3"/>
+        </w:numPr>
+        <w:ind w:left="720" w:hanging="360"/>
+        <w:rPr>
+          <w:b w:val="1"/>
+          <w:bCs w:val="1"/>
+          <w:u w:val="none"/>
+        </w:rPr>
+      </w:pPr>
+      <w:r>
+        <w:rPr>
+          <w:b w:val="1"/>
+          <w:bCs w:val="1"/>
+          <w:rtl w:val="0"/>
+        </w:rPr>
+        <w:t xml:space="preserve">What is ZooKeeper and what are the roles and responsibilities of ZooKeeper?</w:t>
+      </w:r>
+    </w:p>
+    <w:p>
+      <w:pPr>
+        <w:ind w:left="0" w:firstLine="0"/>
+        <w:rPr/>
+      </w:pPr>
+      <w:r>
+        <w:rPr>
+          <w:rtl w:val="0"/>
+        </w:rPr>
+        <w:t xml:space="preserve">It is a centralized coordination service that helps all Kafka Brokers work together.</w:t>
+      </w:r>
+    </w:p>
+    <w:p>
+      <w:pPr>
+        <w:ind w:left="0" w:firstLine="0"/>
+        <w:rPr/>
+      </w:pPr>
+      <w:r>
+        <w:rPr>
+          <w:rtl w:val="0"/>
+        </w:rPr>
+        <w:t xml:space="preserve">Responsibilities of Zookeeper:</w:t>
+      </w:r>
+    </w:p>
+    <w:p>
+      <w:pPr>
+        <w:numPr>
+          <w:ilvl w:val="0"/>
+          <w:numId w:val="1"/>
+        </w:numPr>
+        <w:ind w:left="720" w:hanging="360"/>
+        <w:rPr>
+          <w:u w:val="none"/>
+        </w:rPr>
+      </w:pPr>
+      <w:r>
+        <w:rPr>
+          <w:b w:val="1"/>
+          <w:bCs w:val="1"/>
+          <w:rtl w:val="0"/>
+        </w:rPr>
+        <w:t xml:space="preserve">Broker Registry:</w:t>
+      </w:r>
+      <w:r>
+        <w:rPr>
+          <w:rtl w:val="0"/>
+        </w:rPr>
+        <w:t xml:space="preserve"> It tracks active brokers. Every broker creates an </w:t>
+      </w:r>
+      <w:r>
+        <w:rPr>
+          <w:b w:val="1"/>
+          <w:bCs w:val="1"/>
+          <w:rtl w:val="0"/>
+        </w:rPr>
+        <w:t xml:space="preserve">ephemeral node</w:t>
+      </w:r>
+      <w:r>
+        <w:rPr>
+          <w:rtl w:val="0"/>
+        </w:rPr>
+        <w:t xml:space="preserve"> in ZooKeeper upon startup and sends continuous heartbeats. If a broker fails, the node is deleted, and ZooKeeper alerts the cluster.</w:t>
+      </w:r>
+    </w:p>
+    <w:p>
+      <w:pPr>
+        <w:numPr>
+          <w:ilvl w:val="0"/>
+          <w:numId w:val="1"/>
+        </w:numPr>
+        <w:ind w:left="720" w:hanging="360"/>
+        <w:rPr>
+          <w:u w:val="none"/>
+        </w:rPr>
+      </w:pPr>
+      <w:r>
+        <w:rPr>
+          <w:b w:val="1"/>
+          <w:bCs w:val="1"/>
+          <w:rtl w:val="0"/>
+        </w:rPr>
+        <w:t xml:space="preserve">Controller Election:</w:t>
+      </w:r>
+      <w:r>
+        <w:rPr>
+          <w:rtl w:val="0"/>
+        </w:rPr>
+        <w:t xml:space="preserve"> ZooKeeper ensures that exactly one broker acts as the </w:t>
+      </w:r>
+      <w:r>
+        <w:rPr>
+          <w:b w:val="1"/>
+          <w:bCs w:val="1"/>
+          <w:rtl w:val="0"/>
+        </w:rPr>
+        <w:t xml:space="preserve">Controller</w:t>
+      </w:r>
+      <w:r>
+        <w:rPr>
+          <w:rtl w:val="0"/>
+        </w:rPr>
+        <w:t xml:space="preserve"> at any given time. If the current Controller goes down, ZooKeeper detects it and coordinates the election of a new one to prevent 'split-brain' scenarios. </w:t>
+      </w:r>
+    </w:p>
+    <w:p>
+      <w:pPr>
+        <w:numPr>
+          <w:ilvl w:val="0"/>
+          <w:numId w:val="1"/>
+        </w:numPr>
+        <w:ind w:left="720" w:hanging="360"/>
+        <w:rPr>
+          <w:u w:val="none"/>
+        </w:rPr>
+      </w:pPr>
+      <w:r>
+        <w:rPr>
+          <w:b w:val="1"/>
+          <w:bCs w:val="1"/>
+          <w:rtl w:val="0"/>
+        </w:rPr>
+        <w:t xml:space="preserve">Partition Leader &amp; ISR Management:</w:t>
+      </w:r>
+      <w:r>
+        <w:rPr>
+          <w:rtl w:val="0"/>
+        </w:rPr>
+        <w:t xml:space="preserve"> The Controller uses metadata stored in ZooKeeper to track the </w:t>
+      </w:r>
+      <w:r>
+        <w:rPr>
+          <w:b w:val="1"/>
+          <w:bCs w:val="1"/>
+          <w:rtl w:val="0"/>
+        </w:rPr>
+        <w:t xml:space="preserve">ISR (In-Sync Replicas)</w:t>
+      </w:r>
+      <w:r>
+        <w:rPr>
+          <w:rtl w:val="0"/>
+        </w:rPr>
+        <w:t xml:space="preserve"> for every partition. When a partition leader fails, ZooKeeper’s data determines which healthy replica can step up as the new leader. </w:t>
+      </w:r>
+    </w:p>
+    <w:p>
+      <w:pPr>
+        <w:numPr>
+          <w:ilvl w:val="0"/>
+          <w:numId w:val="1"/>
+        </w:numPr>
+        <w:ind w:left="720" w:hanging="360"/>
+        <w:rPr>
+          <w:u w:val="none"/>
+        </w:rPr>
+      </w:pPr>
+      <w:r>
+        <w:rPr>
+          <w:b w:val="1"/>
+          <w:bCs w:val="1"/>
+          <w:rtl w:val="0"/>
+        </w:rPr>
+        <w:t xml:space="preserve">Configuration &amp; Metadata Storage:</w:t>
+      </w:r>
+      <w:r>
+        <w:rPr>
+          <w:rtl w:val="0"/>
+        </w:rPr>
+        <w:t xml:space="preserve"> It stores cluster-wide configurations, topic definitions, partition counts, replication factors, and operational quotas. </w:t>
+      </w:r>
+    </w:p>
+    <w:p>
+      <w:pPr>
+        <w:ind w:left="720" w:firstLine="0"/>
+        <w:rPr/>
+      </w:pPr>
+      <w:r>
+        <w:rPr>
+          <w:rtl w:val="0"/>
+        </w:rPr>
+      </w:r>
+    </w:p>
+    <w:p>
+      <w:pPr>
+        <w:numPr>
+          <w:ilvl w:val="0"/>
+          <w:numId w:val="3"/>
+        </w:numPr>
+        <w:ind w:left="720" w:hanging="360"/>
+        <w:rPr>
+          <w:b w:val="1"/>
+          <w:bCs w:val="1"/>
+          <w:u w:val="none"/>
+        </w:rPr>
+      </w:pPr>
+      <w:r>
+        <w:rPr>
+          <w:b w:val="1"/>
+          <w:bCs w:val="1"/>
+          <w:rtl w:val="0"/>
+        </w:rPr>
+        <w:t xml:space="preserve">What is KRaft and why Kafka has removed ZooKeeper?</w:t>
+      </w:r>
+    </w:p>
+    <w:p>
+      <w:pPr>
+        <w:ind w:left="0" w:firstLine="0"/>
+        <w:rPr/>
+      </w:pPr>
+      <w:r>
+        <w:rPr>
+          <w:rtl w:val="0"/>
+        </w:rPr>
+      </w:r>
+    </w:p>
+    <w:p>
+      <w:pPr>
+        <w:ind w:left="0" w:firstLine="0"/>
+        <w:rPr/>
+      </w:pPr>
+      <w:r>
+        <w:rPr>
+          <w:rtl w:val="0"/>
+        </w:rPr>
+      </w:r>
+    </w:p>
+    <w:p>
+      <w:pPr>
+        <w:numPr>
+          <w:ilvl w:val="0"/>
+          <w:numId w:val="3"/>
+        </w:numPr>
+        <w:ind w:left="720" w:hanging="360"/>
+        <w:rPr>
+          <w:b w:val="1"/>
+          <w:bCs w:val="1"/>
+          <w:u w:val="none"/>
         </w:rPr>
       </w:pPr>
       <w:r>
@@ -1189,9 +1680,15 @@
     </w:p>
     <w:p>
       <w:pPr>
-        <w:rPr>
-          <w:b w:val="1"/>
-          <w:bCs w:val="1"/>
+        <w:numPr>
+          <w:ilvl w:val="0"/>
+          <w:numId w:val="3"/>
+        </w:numPr>
+        <w:ind w:left="720" w:hanging="360"/>
+        <w:rPr>
+          <w:b w:val="1"/>
+          <w:bCs w:val="1"/>
+          <w:u w:val="none"/>
         </w:rPr>
       </w:pPr>
       <w:r>
@@ -1301,9 +1798,15 @@
     </w:p>
     <w:p>
       <w:pPr>
-        <w:rPr>
-          <w:b w:val="1"/>
-          <w:bCs w:val="1"/>
+        <w:numPr>
+          <w:ilvl w:val="0"/>
+          <w:numId w:val="3"/>
+        </w:numPr>
+        <w:ind w:left="720" w:hanging="360"/>
+        <w:rPr>
+          <w:b w:val="1"/>
+          <w:bCs w:val="1"/>
+          <w:u w:val="none"/>
         </w:rPr>
       </w:pPr>
       <w:r>
@@ -1341,26 +1844,39 @@
       <w:pPr>
         <w:numPr>
           <w:ilvl w:val="0"/>
-          <w:numId w:val="1"/>
+          <w:numId w:val="5"/>
         </w:numPr>
         <w:ind w:left="720" w:hanging="360"/>
         <w:rPr>
           <w:u w:val="none"/>
         </w:rPr>
       </w:pPr>
-      <w:r>
-        <w:rPr>
-          <w:rFonts w:ascii="Arial Unicode MS" w:cs="Arial Unicode MS" w:eastAsia="Arial Unicode MS" w:hAnsi="Arial Unicode MS"/>
-          <w:rtl w:val="0"/>
-        </w:rPr>
-        <w:t xml:space="preserve">Parallelism: Each consumer reads from one or more partitions, thus helping us achieve parallelism. Without partitions: Only one consumer can read → bottleneck</w:t>
-      </w:r>
-    </w:p>
-    <w:p>
-      <w:pPr>
-        <w:numPr>
-          <w:ilvl w:val="0"/>
-          <w:numId w:val="1"/>
+      <w:sdt>
+        <w:sdtPr>
+          <w:id w:val="512099647"/>
+          <w:tag w:val="goog_rdk_1"/>
+        </w:sdtPr>
+        <w:sdtContent>
+          <w:r>
+            <w:rPr>
+              <w:rFonts w:ascii="Arial Unicode MS" w:cs="Arial Unicode MS" w:eastAsia="Arial Unicode MS" w:hAnsi="Arial Unicode MS"/>
+              <w:rtl w:val="0"/>
+            </w:rPr>
+            <w:t xml:space="preserve">Parallelism: Each consumer reads from one or more partitions, thus helping us achieve parallelism. Without partitions: Only one consumer can read → bottleneck</w:t>
+          </w:r>
+        </w:sdtContent>
+      </w:sdt>
+      <w:r>
+        <w:rPr>
+          <w:rtl w:val="0"/>
+        </w:rPr>
+      </w:r>
+    </w:p>
+    <w:p>
+      <w:pPr>
+        <w:numPr>
+          <w:ilvl w:val="0"/>
+          <w:numId w:val="5"/>
         </w:numPr>
         <w:ind w:left="720" w:hanging="360"/>
         <w:rPr>
@@ -1373,24 +1889,42 @@
         </w:rPr>
         <w:t xml:space="preserve">Scalability: Partitions are distributed across multiple brokers. This spreads data and load.</w:t>
       </w:r>
-    </w:p>
-    <w:p>
-      <w:pPr>
-        <w:numPr>
-          <w:ilvl w:val="0"/>
-          <w:numId w:val="1"/>
+      <w:r>
+        <w:rPr>
+          <w:rtl w:val="0"/>
+        </w:rPr>
+      </w:r>
+    </w:p>
+    <w:p>
+      <w:pPr>
+        <w:numPr>
+          <w:ilvl w:val="0"/>
+          <w:numId w:val="5"/>
         </w:numPr>
         <w:ind w:left="720" w:hanging="360"/>
         <w:rPr>
           <w:u w:val="none"/>
         </w:rPr>
       </w:pPr>
-      <w:r>
-        <w:rPr>
-          <w:rFonts w:ascii="Arial Unicode MS" w:cs="Arial Unicode MS" w:eastAsia="Arial Unicode MS" w:hAnsi="Arial Unicode MS"/>
-          <w:rtl w:val="0"/>
-        </w:rPr>
-        <w:t xml:space="preserve">Fault Tolerance: Each partition can have replicas on other brokers. If one broker fails → another takes over. Without partitions: Harder to replicate and recover efficiently.</w:t>
+      <w:sdt>
+        <w:sdtPr>
+          <w:id w:val="628158337"/>
+          <w:tag w:val="goog_rdk_2"/>
+        </w:sdtPr>
+        <w:sdtContent>
+          <w:r>
+            <w:rPr>
+              <w:rFonts w:ascii="Arial Unicode MS" w:cs="Arial Unicode MS" w:eastAsia="Arial Unicode MS" w:hAnsi="Arial Unicode MS"/>
+              <w:rtl w:val="0"/>
+            </w:rPr>
+            <w:t xml:space="preserve">Fault Tolerance: Each partition can have replicas on other brokers. If one broker fails → another takes over. Without partitions: Harder to replicate and recover efficiently.</w:t>
+          </w:r>
+        </w:sdtContent>
+      </w:sdt>
+      <w:r>
+        <w:rPr>
+          <w:rtl w:val="0"/>
+        </w:rPr>
       </w:r>
     </w:p>
     <w:p>
@@ -1406,10 +1940,15 @@
     </w:p>
     <w:p>
       <w:pPr>
-        <w:ind w:left="0" w:firstLine="0"/>
-        <w:rPr>
-          <w:b w:val="1"/>
-          <w:bCs w:val="1"/>
+        <w:numPr>
+          <w:ilvl w:val="0"/>
+          <w:numId w:val="5"/>
+        </w:numPr>
+        <w:ind w:left="720" w:hanging="360"/>
+        <w:rPr>
+          <w:b w:val="1"/>
+          <w:bCs w:val="1"/>
+          <w:u w:val="none"/>
         </w:rPr>
       </w:pPr>
       <w:r>
@@ -1423,7 +1962,6 @@
     </w:p>
     <w:p>
       <w:pPr>
-        <w:ind w:left="0" w:firstLine="0"/>
         <w:rPr/>
       </w:pPr>
       <w:r>
@@ -1437,12 +1975,9 @@
       <w:pPr>
         <w:numPr>
           <w:ilvl w:val="0"/>
-          <w:numId w:val="4"/>
-        </w:numPr>
-        <w:ind w:left="720" w:hanging="360"/>
-        <w:rPr>
-          <w:u w:val="none"/>
-        </w:rPr>
+          <w:numId w:val="9"/>
+        </w:numPr>
+        <w:ind w:left="720" w:hanging="360"/>
       </w:pPr>
       <w:r>
         <w:rPr>
@@ -1515,13 +2050,10 @@
       <w:pPr>
         <w:numPr>
           <w:ilvl w:val="0"/>
-          <w:numId w:val="6"/>
-        </w:numPr>
-        <w:spacing w:after="0" w:afterAutospacing="0" w:before="240" w:lineRule="auto"/>
-        <w:ind w:left="720" w:hanging="360"/>
-        <w:rPr>
-          <w:u w:val="none"/>
-        </w:rPr>
+          <w:numId w:val="8"/>
+        </w:numPr>
+        <w:spacing w:before="240" w:lineRule="auto"/>
+        <w:ind w:left="720" w:hanging="360"/>
       </w:pPr>
       <w:r>
         <w:rPr>
@@ -1531,25 +2063,34 @@
         </w:rPr>
         <w:t xml:space="preserve">--topic</w:t>
       </w:r>
-      <w:r>
-        <w:rPr>
-          <w:rFonts w:ascii="Arial Unicode MS" w:cs="Arial Unicode MS" w:eastAsia="Arial Unicode MS" w:hAnsi="Arial Unicode MS"/>
-          <w:rtl w:val="0"/>
-        </w:rPr>
-        <w:t xml:space="preserve"> → name of the topic</w:t>
-      </w:r>
-    </w:p>
-    <w:p>
-      <w:pPr>
-        <w:numPr>
-          <w:ilvl w:val="0"/>
-          <w:numId w:val="6"/>
-        </w:numPr>
-        <w:spacing w:after="0" w:afterAutospacing="0" w:before="0" w:beforeAutospacing="0" w:lineRule="auto"/>
-        <w:ind w:left="720" w:hanging="360"/>
-        <w:rPr>
-          <w:u w:val="none"/>
-        </w:rPr>
+      <w:sdt>
+        <w:sdtPr>
+          <w:id w:val="1899834248"/>
+          <w:tag w:val="goog_rdk_3"/>
+        </w:sdtPr>
+        <w:sdtContent>
+          <w:r>
+            <w:rPr>
+              <w:rFonts w:ascii="Arial Unicode MS" w:cs="Arial Unicode MS" w:eastAsia="Arial Unicode MS" w:hAnsi="Arial Unicode MS"/>
+              <w:rtl w:val="0"/>
+            </w:rPr>
+            <w:t xml:space="preserve"> → name of the topic</w:t>
+          </w:r>
+        </w:sdtContent>
+      </w:sdt>
+      <w:r>
+        <w:rPr>
+          <w:rtl w:val="0"/>
+        </w:rPr>
+      </w:r>
+    </w:p>
+    <w:p>
+      <w:pPr>
+        <w:numPr>
+          <w:ilvl w:val="0"/>
+          <w:numId w:val="8"/>
+        </w:numPr>
+        <w:ind w:left="720" w:hanging="360"/>
       </w:pPr>
       <w:r>
         <w:rPr>
@@ -1559,25 +2100,34 @@
         </w:rPr>
         <w:t xml:space="preserve">--bootstrap-server</w:t>
       </w:r>
-      <w:r>
-        <w:rPr>
-          <w:rFonts w:ascii="Arial Unicode MS" w:cs="Arial Unicode MS" w:eastAsia="Arial Unicode MS" w:hAnsi="Arial Unicode MS"/>
-          <w:rtl w:val="0"/>
-        </w:rPr>
-        <w:t xml:space="preserve"> → Kafka broker address.</w:t>
-      </w:r>
-    </w:p>
-    <w:p>
-      <w:pPr>
-        <w:numPr>
-          <w:ilvl w:val="0"/>
-          <w:numId w:val="6"/>
-        </w:numPr>
-        <w:spacing w:after="0" w:afterAutospacing="0" w:before="0" w:beforeAutospacing="0" w:lineRule="auto"/>
-        <w:ind w:left="720" w:hanging="360"/>
-        <w:rPr>
-          <w:u w:val="none"/>
-        </w:rPr>
+      <w:sdt>
+        <w:sdtPr>
+          <w:id w:val="-863743289"/>
+          <w:tag w:val="goog_rdk_4"/>
+        </w:sdtPr>
+        <w:sdtContent>
+          <w:r>
+            <w:rPr>
+              <w:rFonts w:ascii="Arial Unicode MS" w:cs="Arial Unicode MS" w:eastAsia="Arial Unicode MS" w:hAnsi="Arial Unicode MS"/>
+              <w:rtl w:val="0"/>
+            </w:rPr>
+            <w:t xml:space="preserve"> → Kafka broker address.</w:t>
+          </w:r>
+        </w:sdtContent>
+      </w:sdt>
+      <w:r>
+        <w:rPr>
+          <w:rtl w:val="0"/>
+        </w:rPr>
+      </w:r>
+    </w:p>
+    <w:p>
+      <w:pPr>
+        <w:numPr>
+          <w:ilvl w:val="0"/>
+          <w:numId w:val="8"/>
+        </w:numPr>
+        <w:ind w:left="720" w:hanging="360"/>
       </w:pPr>
       <w:r>
         <w:rPr>
@@ -1587,25 +2137,35 @@
         </w:rPr>
         <w:t xml:space="preserve">--partitions</w:t>
       </w:r>
-      <w:r>
-        <w:rPr>
-          <w:rFonts w:ascii="Arial Unicode MS" w:cs="Arial Unicode MS" w:eastAsia="Arial Unicode MS" w:hAnsi="Arial Unicode MS"/>
-          <w:rtl w:val="0"/>
-        </w:rPr>
-        <w:t xml:space="preserve"> → number of partitions that each topic will have.</w:t>
-      </w:r>
-    </w:p>
-    <w:p>
-      <w:pPr>
-        <w:numPr>
-          <w:ilvl w:val="0"/>
-          <w:numId w:val="6"/>
-        </w:numPr>
-        <w:spacing w:after="240" w:before="0" w:beforeAutospacing="0" w:lineRule="auto"/>
-        <w:ind w:left="720" w:hanging="360"/>
-        <w:rPr>
-          <w:u w:val="none"/>
-        </w:rPr>
+      <w:sdt>
+        <w:sdtPr>
+          <w:id w:val="229324797"/>
+          <w:tag w:val="goog_rdk_5"/>
+        </w:sdtPr>
+        <w:sdtContent>
+          <w:r>
+            <w:rPr>
+              <w:rFonts w:ascii="Arial Unicode MS" w:cs="Arial Unicode MS" w:eastAsia="Arial Unicode MS" w:hAnsi="Arial Unicode MS"/>
+              <w:rtl w:val="0"/>
+            </w:rPr>
+            <w:t xml:space="preserve"> → number of partitions that each topic will have.</w:t>
+          </w:r>
+        </w:sdtContent>
+      </w:sdt>
+      <w:r>
+        <w:rPr>
+          <w:rtl w:val="0"/>
+        </w:rPr>
+      </w:r>
+    </w:p>
+    <w:p>
+      <w:pPr>
+        <w:numPr>
+          <w:ilvl w:val="0"/>
+          <w:numId w:val="8"/>
+        </w:numPr>
+        <w:spacing w:after="240" w:lineRule="auto"/>
+        <w:ind w:left="720" w:hanging="360"/>
       </w:pPr>
       <w:r>
         <w:rPr>
@@ -1615,12 +2175,151 @@
         </w:rPr>
         <w:t xml:space="preserve">--replication-factor</w:t>
       </w:r>
-      <w:r>
-        <w:rPr>
-          <w:rFonts w:ascii="Arial Unicode MS" w:cs="Arial Unicode MS" w:eastAsia="Arial Unicode MS" w:hAnsi="Arial Unicode MS"/>
-          <w:rtl w:val="0"/>
-        </w:rPr>
-        <w:t xml:space="preserve"> → number of replicas that each partition will have.</w:t>
+      <w:sdt>
+        <w:sdtPr>
+          <w:id w:val="-1448988653"/>
+          <w:tag w:val="goog_rdk_6"/>
+        </w:sdtPr>
+        <w:sdtContent>
+          <w:r>
+            <w:rPr>
+              <w:rFonts w:ascii="Arial Unicode MS" w:cs="Arial Unicode MS" w:eastAsia="Arial Unicode MS" w:hAnsi="Arial Unicode MS"/>
+              <w:rtl w:val="0"/>
+            </w:rPr>
+            <w:t xml:space="preserve"> → number of replicas that each partition will have.</w:t>
+          </w:r>
+        </w:sdtContent>
+      </w:sdt>
+      <w:r>
+        <w:rPr>
+          <w:rtl w:val="0"/>
+        </w:rPr>
+      </w:r>
+    </w:p>
+    <w:p>
+      <w:pPr>
+        <w:numPr>
+          <w:ilvl w:val="0"/>
+          <w:numId w:val="9"/>
+        </w:numPr>
+        <w:ind w:left="720" w:hanging="360"/>
+      </w:pPr>
+      <w:r>
+        <w:rPr>
+          <w:rtl w:val="0"/>
+        </w:rPr>
+        <w:t xml:space="preserve">Auto Topic Creation (Not Recommended in Production): Kafka can automatically create a topic, but there is No control over partitions/replication.</w:t>
+      </w:r>
+    </w:p>
+    <w:p>
+      <w:pPr>
+        <w:numPr>
+          <w:ilvl w:val="0"/>
+          <w:numId w:val="9"/>
+        </w:numPr>
+        <w:ind w:left="720" w:hanging="360"/>
+      </w:pPr>
+      <w:r>
+        <w:rPr>
+          <w:rtl w:val="0"/>
+        </w:rPr>
+        <w:t xml:space="preserve">Using Spring Boot : With Spring Kafka</w:t>
+      </w:r>
+    </w:p>
+    <w:p>
+      <w:pPr>
+        <w:ind w:left="1440" w:firstLine="0"/>
+        <w:rPr/>
+      </w:pPr>
+      <w:r>
+        <w:rPr>
+          <w:rtl w:val="0"/>
+        </w:rPr>
+        <w:t xml:space="preserve">@Bean</w:t>
+      </w:r>
+    </w:p>
+    <w:p>
+      <w:pPr>
+        <w:ind w:left="1440" w:firstLine="0"/>
+        <w:rPr/>
+      </w:pPr>
+      <w:r>
+        <w:rPr>
+          <w:rtl w:val="0"/>
+        </w:rPr>
+        <w:t xml:space="preserve">public NewTopic createTopic() {</w:t>
+      </w:r>
+    </w:p>
+    <w:p>
+      <w:pPr>
+        <w:ind w:left="1440" w:firstLine="0"/>
+        <w:rPr/>
+      </w:pPr>
+      <w:r>
+        <w:rPr>
+          <w:rtl w:val="0"/>
+        </w:rPr>
+        <w:t xml:space="preserve">    return TopicBuilder.name("my-topic")</w:t>
+      </w:r>
+    </w:p>
+    <w:p>
+      <w:pPr>
+        <w:ind w:left="1440" w:firstLine="0"/>
+        <w:rPr/>
+      </w:pPr>
+      <w:r>
+        <w:rPr>
+          <w:rtl w:val="0"/>
+        </w:rPr>
+        <w:t xml:space="preserve">            .partitions(3)</w:t>
+      </w:r>
+    </w:p>
+    <w:p>
+      <w:pPr>
+        <w:ind w:left="1440" w:firstLine="0"/>
+        <w:rPr/>
+      </w:pPr>
+      <w:r>
+        <w:rPr>
+          <w:rtl w:val="0"/>
+        </w:rPr>
+        <w:t xml:space="preserve">            .replicas(2)</w:t>
+      </w:r>
+    </w:p>
+    <w:p>
+      <w:pPr>
+        <w:ind w:left="1440" w:firstLine="0"/>
+        <w:rPr/>
+      </w:pPr>
+      <w:r>
+        <w:rPr>
+          <w:rtl w:val="0"/>
+        </w:rPr>
+        <w:t xml:space="preserve">            .build();</w:t>
+      </w:r>
+    </w:p>
+    <w:p>
+      <w:pPr>
+        <w:ind w:left="1440" w:firstLine="0"/>
+        <w:rPr/>
+      </w:pPr>
+      <w:r>
+        <w:rPr>
+          <w:rtl w:val="0"/>
+        </w:rPr>
+        <w:t xml:space="preserve">}</w:t>
+      </w:r>
+    </w:p>
+    <w:p>
+      <w:pPr>
+        <w:ind w:firstLine="720"/>
+        <w:rPr/>
+      </w:pPr>
+      <w:r>
+        <w:rPr>
+          <w:rtl w:val="0"/>
+        </w:rPr>
+        <w:t xml:space="preserve">Spring will automatically create the topic at startup.</w:t>
       </w:r>
     </w:p>
     <w:p>
@@ -1632,224 +2331,90 @@
         <w:rPr>
           <w:rtl w:val="0"/>
         </w:rPr>
-      </w:r>
-    </w:p>
-    <w:p>
-      <w:pPr>
-        <w:numPr>
-          <w:ilvl w:val="0"/>
-          <w:numId w:val="4"/>
-        </w:numPr>
-        <w:ind w:left="720" w:hanging="360"/>
-        <w:rPr>
+        <w:t xml:space="preserve">Using AdminClient API.</w:t>
+      </w:r>
+    </w:p>
+    <w:p>
+      <w:pPr>
+        <w:rPr>
+          <w:b w:val="1"/>
+          <w:bCs w:val="1"/>
+        </w:rPr>
+      </w:pPr>
+      <w:r>
+        <w:rPr>
+          <w:rtl w:val="0"/>
+        </w:rPr>
+      </w:r>
+    </w:p>
+    <w:p>
+      <w:pPr>
+        <w:numPr>
+          <w:ilvl w:val="0"/>
+          <w:numId w:val="5"/>
+        </w:numPr>
+        <w:ind w:left="720" w:hanging="360"/>
+        <w:rPr>
+          <w:b w:val="1"/>
+          <w:bCs w:val="1"/>
           <w:u w:val="none"/>
         </w:rPr>
       </w:pPr>
       <w:r>
         <w:rPr>
-          <w:rtl w:val="0"/>
-        </w:rPr>
-        <w:t xml:space="preserve">Auto Topic Creation (Not Recommended in Production): Kafka can automatically create a topic, but there is No control over partitions/replication.</w:t>
-      </w:r>
-    </w:p>
-    <w:p>
-      <w:pPr>
-        <w:numPr>
-          <w:ilvl w:val="0"/>
-          <w:numId w:val="4"/>
-        </w:numPr>
-        <w:ind w:left="720" w:hanging="360"/>
-        <w:rPr>
+          <w:b w:val="1"/>
+          <w:bCs w:val="1"/>
+          <w:rtl w:val="0"/>
+        </w:rPr>
+        <w:t xml:space="preserve">How do consumers consume events in Kafka?</w:t>
+      </w:r>
+    </w:p>
+    <w:p>
+      <w:pPr>
+        <w:rPr/>
+      </w:pPr>
+      <w:r>
+        <w:rPr>
+          <w:rtl w:val="0"/>
+        </w:rPr>
+        <w:t xml:space="preserve">In Kafka, consumers consume events by subscribing to a topic and continuously </w:t>
+      </w:r>
+      <w:r>
+        <w:rPr>
+          <w:b w:val="1"/>
+          <w:bCs w:val="1"/>
+          <w:rtl w:val="0"/>
+        </w:rPr>
+        <w:t xml:space="preserve">polling</w:t>
+      </w:r>
+      <w:r>
+        <w:rPr>
+          <w:rtl w:val="0"/>
+        </w:rPr>
+        <w:t xml:space="preserve"> the broker for new messages. They read data from assigned partitions and use offsets to keep track of their progress.</w:t>
+      </w:r>
+    </w:p>
+    <w:p>
+      <w:pPr>
+        <w:rPr/>
+      </w:pPr>
+      <w:r>
+        <w:rPr>
+          <w:rtl w:val="0"/>
+        </w:rPr>
+      </w:r>
+    </w:p>
+    <w:p>
+      <w:pPr>
+        <w:numPr>
+          <w:ilvl w:val="0"/>
+          <w:numId w:val="5"/>
+        </w:numPr>
+        <w:ind w:left="720" w:hanging="360"/>
+        <w:rPr>
+          <w:b w:val="1"/>
+          <w:bCs w:val="1"/>
           <w:u w:val="none"/>
-        </w:rPr>
-      </w:pPr>
-      <w:r>
-        <w:rPr>
-          <w:rtl w:val="0"/>
-        </w:rPr>
-        <w:t xml:space="preserve">Using Spring Boot : With Spring Kafka</w:t>
-      </w:r>
-    </w:p>
-    <w:p>
-      <w:pPr>
-        <w:ind w:left="1440" w:firstLine="0"/>
-        <w:rPr/>
-      </w:pPr>
-      <w:r>
-        <w:rPr>
-          <w:rtl w:val="0"/>
-        </w:rPr>
-        <w:t xml:space="preserve">@Bean</w:t>
-      </w:r>
-    </w:p>
-    <w:p>
-      <w:pPr>
-        <w:ind w:left="1440" w:firstLine="0"/>
-        <w:rPr/>
-      </w:pPr>
-      <w:r>
-        <w:rPr>
-          <w:rtl w:val="0"/>
-        </w:rPr>
-        <w:t xml:space="preserve">public NewTopic createTopic() {</w:t>
-      </w:r>
-    </w:p>
-    <w:p>
-      <w:pPr>
-        <w:ind w:left="1440" w:firstLine="0"/>
-        <w:rPr/>
-      </w:pPr>
-      <w:r>
-        <w:rPr>
-          <w:rtl w:val="0"/>
-        </w:rPr>
-        <w:t xml:space="preserve">    return TopicBuilder.name("my-topic")</w:t>
-      </w:r>
-    </w:p>
-    <w:p>
-      <w:pPr>
-        <w:ind w:left="1440" w:firstLine="0"/>
-        <w:rPr/>
-      </w:pPr>
-      <w:r>
-        <w:rPr>
-          <w:rtl w:val="0"/>
-        </w:rPr>
-        <w:t xml:space="preserve">            .partitions(3)</w:t>
-      </w:r>
-    </w:p>
-    <w:p>
-      <w:pPr>
-        <w:ind w:left="1440" w:firstLine="0"/>
-        <w:rPr/>
-      </w:pPr>
-      <w:r>
-        <w:rPr>
-          <w:rtl w:val="0"/>
-        </w:rPr>
-        <w:t xml:space="preserve">            .replicas(2)</w:t>
-      </w:r>
-    </w:p>
-    <w:p>
-      <w:pPr>
-        <w:ind w:left="1440" w:firstLine="0"/>
-        <w:rPr/>
-      </w:pPr>
-      <w:r>
-        <w:rPr>
-          <w:rtl w:val="0"/>
-        </w:rPr>
-        <w:t xml:space="preserve">            .build();</w:t>
-      </w:r>
-    </w:p>
-    <w:p>
-      <w:pPr>
-        <w:ind w:left="1440" w:firstLine="0"/>
-        <w:rPr/>
-      </w:pPr>
-      <w:r>
-        <w:rPr>
-          <w:rtl w:val="0"/>
-        </w:rPr>
-        <w:t xml:space="preserve">}</w:t>
-      </w:r>
-    </w:p>
-    <w:p>
-      <w:pPr>
-        <w:ind w:firstLine="720"/>
-        <w:rPr/>
-      </w:pPr>
-      <w:r>
-        <w:rPr>
-          <w:rtl w:val="0"/>
-        </w:rPr>
-        <w:t xml:space="preserve">Spring will automatically create the topic at startup.</w:t>
-      </w:r>
-    </w:p>
-    <w:p>
-      <w:pPr>
-        <w:numPr>
-          <w:ilvl w:val="0"/>
-          <w:numId w:val="4"/>
-        </w:numPr>
-        <w:ind w:left="720" w:hanging="360"/>
-        <w:rPr>
-          <w:u w:val="none"/>
-        </w:rPr>
-      </w:pPr>
-      <w:r>
-        <w:rPr>
-          <w:rtl w:val="0"/>
-        </w:rPr>
-        <w:t xml:space="preserve">Using AdminClient API.</w:t>
-      </w:r>
-    </w:p>
-    <w:p>
-      <w:pPr>
-        <w:rPr/>
-      </w:pPr>
-      <w:r>
-        <w:rPr>
-          <w:rtl w:val="0"/>
-        </w:rPr>
-      </w:r>
-    </w:p>
-    <w:p>
-      <w:pPr>
-        <w:rPr>
-          <w:b w:val="1"/>
-          <w:bCs w:val="1"/>
-        </w:rPr>
-      </w:pPr>
-      <w:r>
-        <w:rPr>
-          <w:b w:val="1"/>
-          <w:bCs w:val="1"/>
-          <w:rtl w:val="0"/>
-        </w:rPr>
-        <w:t xml:space="preserve">How do consumers consume events in Kafka?</w:t>
-      </w:r>
-    </w:p>
-    <w:p>
-      <w:pPr>
-        <w:rPr/>
-      </w:pPr>
-      <w:r>
-        <w:rPr>
-          <w:rtl w:val="0"/>
-        </w:rPr>
-        <w:t xml:space="preserve">In Kafka, consumers consume events by subscribing to a topic and continuously </w:t>
-      </w:r>
-      <w:r>
-        <w:rPr>
-          <w:b w:val="1"/>
-          <w:bCs w:val="1"/>
-          <w:rtl w:val="0"/>
-        </w:rPr>
-        <w:t xml:space="preserve">polling</w:t>
-      </w:r>
-      <w:r>
-        <w:rPr>
-          <w:rtl w:val="0"/>
-        </w:rPr>
-        <w:t xml:space="preserve"> the broker for new messages. They read data from assigned partitions and use offsets to keep track of their progress.</w:t>
-      </w:r>
-    </w:p>
-    <w:p>
-      <w:pPr>
-        <w:rPr/>
-      </w:pPr>
-      <w:r>
-        <w:rPr>
-          <w:rtl w:val="0"/>
-        </w:rPr>
-      </w:r>
-    </w:p>
-    <w:p>
-      <w:pPr>
-        <w:rPr>
-          <w:b w:val="1"/>
-          <w:bCs w:val="1"/>
         </w:rPr>
       </w:pPr>
       <w:r>
@@ -1886,9 +2451,15 @@
     </w:p>
     <w:p>
       <w:pPr>
-        <w:rPr>
-          <w:b w:val="1"/>
-          <w:bCs w:val="1"/>
+        <w:numPr>
+          <w:ilvl w:val="0"/>
+          <w:numId w:val="5"/>
+        </w:numPr>
+        <w:ind w:left="720" w:hanging="360"/>
+        <w:rPr>
+          <w:b w:val="1"/>
+          <w:bCs w:val="1"/>
+          <w:u w:val="none"/>
         </w:rPr>
       </w:pPr>
       <w:r>
@@ -1945,9 +2516,15 @@
     </w:p>
     <w:p>
       <w:pPr>
-        <w:rPr>
-          <w:b w:val="1"/>
-          <w:bCs w:val="1"/>
+        <w:numPr>
+          <w:ilvl w:val="0"/>
+          <w:numId w:val="5"/>
+        </w:numPr>
+        <w:ind w:left="720" w:hanging="360"/>
+        <w:rPr>
+          <w:b w:val="1"/>
+          <w:bCs w:val="1"/>
+          <w:u w:val="none"/>
         </w:rPr>
       </w:pPr>
       <w:r>
@@ -2037,9 +2614,15 @@
     </w:p>
     <w:p>
       <w:pPr>
-        <w:rPr>
-          <w:b w:val="1"/>
-          <w:bCs w:val="1"/>
+        <w:numPr>
+          <w:ilvl w:val="0"/>
+          <w:numId w:val="5"/>
+        </w:numPr>
+        <w:ind w:left="720" w:hanging="360"/>
+        <w:rPr>
+          <w:b w:val="1"/>
+          <w:bCs w:val="1"/>
+          <w:u w:val="none"/>
         </w:rPr>
       </w:pPr>
       <w:r>
@@ -2107,9 +2690,15 @@
     </w:p>
     <w:p>
       <w:pPr>
-        <w:rPr>
-          <w:b w:val="1"/>
-          <w:bCs w:val="1"/>
+        <w:numPr>
+          <w:ilvl w:val="0"/>
+          <w:numId w:val="5"/>
+        </w:numPr>
+        <w:ind w:left="720" w:hanging="360"/>
+        <w:rPr>
+          <w:b w:val="1"/>
+          <w:bCs w:val="1"/>
+          <w:u w:val="none"/>
         </w:rPr>
       </w:pPr>
       <w:r>
@@ -2144,9 +2733,15 @@
     </w:p>
     <w:p>
       <w:pPr>
-        <w:rPr>
-          <w:b w:val="1"/>
-          <w:bCs w:val="1"/>
+        <w:numPr>
+          <w:ilvl w:val="0"/>
+          <w:numId w:val="5"/>
+        </w:numPr>
+        <w:ind w:left="720" w:hanging="360"/>
+        <w:rPr>
+          <w:b w:val="1"/>
+          <w:bCs w:val="1"/>
+          <w:u w:val="none"/>
         </w:rPr>
       </w:pPr>
       <w:r>
@@ -2181,9 +2776,15 @@
     </w:p>
     <w:p>
       <w:pPr>
-        <w:rPr>
-          <w:b w:val="1"/>
-          <w:bCs w:val="1"/>
+        <w:numPr>
+          <w:ilvl w:val="0"/>
+          <w:numId w:val="5"/>
+        </w:numPr>
+        <w:ind w:left="720" w:hanging="360"/>
+        <w:rPr>
+          <w:b w:val="1"/>
+          <w:bCs w:val="1"/>
+          <w:u w:val="none"/>
         </w:rPr>
       </w:pPr>
       <w:r>
@@ -2218,9 +2819,15 @@
     </w:p>
     <w:p>
       <w:pPr>
-        <w:rPr>
-          <w:b w:val="1"/>
-          <w:bCs w:val="1"/>
+        <w:numPr>
+          <w:ilvl w:val="0"/>
+          <w:numId w:val="5"/>
+        </w:numPr>
+        <w:ind w:left="720" w:hanging="360"/>
+        <w:rPr>
+          <w:b w:val="1"/>
+          <w:bCs w:val="1"/>
+          <w:u w:val="none"/>
         </w:rPr>
       </w:pPr>
       <w:r>
@@ -2236,7 +2843,7 @@
       <w:pPr>
         <w:numPr>
           <w:ilvl w:val="0"/>
-          <w:numId w:val="3"/>
+          <w:numId w:val="2"/>
         </w:numPr>
         <w:ind w:left="720" w:hanging="360"/>
         <w:rPr>
@@ -2245,16 +2852,24 @@
       </w:pPr>
       <w:r>
         <w:rPr>
-          <w:rtl w:val="0"/>
-        </w:rPr>
-        <w:t xml:space="preserve">Auto-Commit: The consumer automatically commits its latest offset at a fixed interval. It is not a recommended strategy.</w:t>
-      </w:r>
-    </w:p>
-    <w:p>
-      <w:pPr>
-        <w:numPr>
-          <w:ilvl w:val="0"/>
-          <w:numId w:val="3"/>
+          <w:i w:val="1"/>
+          <w:iCs w:val="1"/>
+          <w:rtl w:val="0"/>
+        </w:rPr>
+        <w:t xml:space="preserve">Auto-Commit</w:t>
+      </w:r>
+      <w:r>
+        <w:rPr>
+          <w:rtl w:val="0"/>
+        </w:rPr>
+        <w:t xml:space="preserve">: The consumer automatically commits its latest offset at a fixed interval. It is not a recommended strategy.</w:t>
+      </w:r>
+    </w:p>
+    <w:p>
+      <w:pPr>
+        <w:numPr>
+          <w:ilvl w:val="0"/>
+          <w:numId w:val="2"/>
         </w:numPr>
         <w:ind w:left="720" w:hanging="360"/>
         <w:rPr>
@@ -2263,9 +2878,17 @@
       </w:pPr>
       <w:r>
         <w:rPr>
-          <w:rtl w:val="0"/>
-        </w:rPr>
-        <w:t xml:space="preserve">Manual Sync Commit (commitSync()): The consumer explicitly tells Kafka to commit the offset and </w:t>
+          <w:i w:val="1"/>
+          <w:iCs w:val="1"/>
+          <w:rtl w:val="0"/>
+        </w:rPr>
+        <w:t xml:space="preserve">Manual Sync Commit (commitSync())</w:t>
+      </w:r>
+      <w:r>
+        <w:rPr>
+          <w:rtl w:val="0"/>
+        </w:rPr>
+        <w:t xml:space="preserve">: The consumer explicitly tells Kafka to commit the offset and </w:t>
       </w:r>
       <w:r>
         <w:rPr>
@@ -2286,7 +2909,7 @@
       <w:pPr>
         <w:numPr>
           <w:ilvl w:val="0"/>
-          <w:numId w:val="3"/>
+          <w:numId w:val="2"/>
         </w:numPr>
         <w:ind w:left="720" w:hanging="360"/>
         <w:rPr>
@@ -2295,9 +2918,17 @@
       </w:pPr>
       <w:r>
         <w:rPr>
-          <w:rtl w:val="0"/>
-        </w:rPr>
-        <w:t xml:space="preserve">Manual Async Commit (commitAsync()): The consumer sends the commit request to the broker but </w:t>
+          <w:i w:val="1"/>
+          <w:iCs w:val="1"/>
+          <w:rtl w:val="0"/>
+        </w:rPr>
+        <w:t xml:space="preserve">Manual Async Commit (commitAsync())</w:t>
+      </w:r>
+      <w:r>
+        <w:rPr>
+          <w:rtl w:val="0"/>
+        </w:rPr>
+        <w:t xml:space="preserve">: The consumer sends the commit request to the broker but </w:t>
       </w:r>
       <w:r>
         <w:rPr>
@@ -2316,6 +2947,50 @@
     </w:p>
     <w:p>
       <w:pPr>
+        <w:ind w:left="720" w:firstLine="0"/>
+        <w:rPr/>
+      </w:pPr>
+      <w:r>
+        <w:rPr>
+          <w:rtl w:val="0"/>
+        </w:rPr>
+      </w:r>
+    </w:p>
+    <w:p>
+      <w:pPr>
+        <w:numPr>
+          <w:ilvl w:val="0"/>
+          <w:numId w:val="5"/>
+        </w:numPr>
+        <w:ind w:left="720" w:hanging="360"/>
+        <w:rPr>
+          <w:b w:val="1"/>
+          <w:bCs w:val="1"/>
+          <w:u w:val="none"/>
+        </w:rPr>
+      </w:pPr>
+      <w:r>
+        <w:rPr>
+          <w:rtl w:val="0"/>
+        </w:rPr>
+        <w:t xml:space="preserve"> </w:t>
+      </w:r>
+      <w:r>
+        <w:rPr>
+          <w:b w:val="1"/>
+          <w:bCs w:val="1"/>
+          <w:rtl w:val="0"/>
+        </w:rPr>
+        <w:t xml:space="preserve">What is a Delivery Guarantee?</w:t>
+      </w:r>
+      <w:r>
+        <w:rPr>
+          <w:rtl w:val="0"/>
+        </w:rPr>
+      </w:r>
+    </w:p>
+    <w:p>
+      <w:pPr>
         <w:ind w:left="0" w:firstLine="0"/>
         <w:rPr/>
       </w:pPr>
@@ -2323,34 +2998,142 @@
         <w:rPr>
           <w:rtl w:val="0"/>
         </w:rPr>
+        <w:t xml:space="preserve">Kafka supports three delivery guarantees, which define how reliably messages are delivered between producers and consumers. </w:t>
+      </w:r>
+    </w:p>
+    <w:p>
+      <w:pPr>
+        <w:numPr>
+          <w:ilvl w:val="0"/>
+          <w:numId w:val="7"/>
+        </w:numPr>
+        <w:ind w:left="720" w:hanging="360"/>
+        <w:rPr>
+          <w:u w:val="none"/>
+        </w:rPr>
+      </w:pPr>
+      <w:r>
+        <w:rPr>
+          <w:rtl w:val="0"/>
+        </w:rPr>
+        <w:t xml:space="preserve">At Most Once (commits offset before processing), where messages may be lost but never duplicated; </w:t>
+      </w:r>
+      <w:r>
+        <w:rPr>
+          <w:rtl w:val="0"/>
+        </w:rPr>
+      </w:r>
+    </w:p>
+    <w:p>
+      <w:pPr>
+        <w:numPr>
+          <w:ilvl w:val="0"/>
+          <w:numId w:val="7"/>
+        </w:numPr>
+        <w:ind w:left="720" w:hanging="360"/>
+        <w:rPr>
+          <w:u w:val="none"/>
+        </w:rPr>
+      </w:pPr>
+      <w:r>
+        <w:rPr>
+          <w:rtl w:val="0"/>
+        </w:rPr>
+        <w:t xml:space="preserve">At Least Once (commits offset after processing), where messages are not lost but may be processed multiple times; and </w:t>
+      </w:r>
+      <w:r>
+        <w:rPr>
+          <w:rtl w:val="0"/>
+        </w:rPr>
+      </w:r>
+    </w:p>
+    <w:p>
+      <w:pPr>
+        <w:numPr>
+          <w:ilvl w:val="0"/>
+          <w:numId w:val="7"/>
+        </w:numPr>
+        <w:ind w:left="720" w:hanging="360"/>
+        <w:rPr>
+          <w:u w:val="none"/>
+        </w:rPr>
+      </w:pPr>
+      <w:r>
+        <w:rPr>
+          <w:rtl w:val="0"/>
+        </w:rPr>
+        <w:t xml:space="preserve">Exactly Once, where messages are processed exactly once using idempotent producers and transactional guarantees. </w:t>
+      </w:r>
+      <w:r>
+        <w:rPr>
+          <w:rtl w:val="0"/>
+        </w:rPr>
       </w:r>
     </w:p>
     <w:p>
       <w:pPr>
         <w:ind w:left="0" w:firstLine="0"/>
-        <w:rPr>
-          <w:b w:val="1"/>
-          <w:bCs w:val="1"/>
-        </w:rPr>
-      </w:pPr>
-      <w:r>
-        <w:rPr>
-          <w:rtl w:val="0"/>
-        </w:rPr>
+        <w:rPr/>
+      </w:pPr>
+      <w:r>
+        <w:rPr>
+          <w:rtl w:val="0"/>
+        </w:rPr>
+      </w:r>
+    </w:p>
+    <w:p>
+      <w:pPr>
+        <w:numPr>
+          <w:ilvl w:val="0"/>
+          <w:numId w:val="5"/>
+        </w:numPr>
+        <w:ind w:left="720" w:hanging="360"/>
+        <w:rPr>
+          <w:b w:val="1"/>
+          <w:bCs w:val="1"/>
+          <w:u w:val="none"/>
+        </w:rPr>
+      </w:pPr>
+      <w:r>
+        <w:rPr>
+          <w:b w:val="1"/>
+          <w:bCs w:val="1"/>
+          <w:rtl w:val="0"/>
+        </w:rPr>
+        <w:t xml:space="preserve">What are idempotent producers?</w:t>
       </w:r>
     </w:p>
     <w:p>
       <w:pPr>
         <w:ind w:left="0" w:firstLine="0"/>
-        <w:rPr>
-          <w:b w:val="1"/>
-          <w:bCs w:val="1"/>
-        </w:rPr>
-      </w:pPr>
-      <w:r>
-        <w:rPr>
-          <w:rtl w:val="0"/>
-        </w:rPr>
+        <w:rPr/>
+      </w:pPr>
+      <w:r>
+        <w:rPr>
+          <w:rtl w:val="0"/>
+        </w:rPr>
+      </w:r>
+    </w:p>
+    <w:p>
+      <w:pPr>
+        <w:numPr>
+          <w:ilvl w:val="0"/>
+          <w:numId w:val="5"/>
+        </w:numPr>
+        <w:ind w:left="720" w:hanging="360"/>
+        <w:rPr>
+          <w:b w:val="1"/>
+          <w:bCs w:val="1"/>
+          <w:u w:val="none"/>
+        </w:rPr>
+      </w:pPr>
+      <w:r>
+        <w:rPr>
+          <w:b w:val="1"/>
+          <w:bCs w:val="1"/>
+          <w:rtl w:val="0"/>
+        </w:rPr>
+        <w:t xml:space="preserve">What is Backpressure?</w:t>
       </w:r>
     </w:p>
     <w:p>
@@ -2360,16 +3143,9 @@
       </w:pPr>
       <w:r>
         <w:rPr>
-          <w:b w:val="1"/>
-          <w:bCs w:val="1"/>
-          <w:rtl w:val="0"/>
-        </w:rPr>
-        <w:t xml:space="preserve">What is a Delivery Guarantee?</w:t>
-      </w:r>
-      <w:r>
-        <w:rPr>
-          <w:rtl w:val="0"/>
-        </w:rPr>
+          <w:rtl w:val="0"/>
+        </w:rPr>
+        <w:t xml:space="preserve">Backpressure occurs when consumers are unable to process events as fast as producers are sending them</w:t>
       </w:r>
     </w:p>
     <w:p>
@@ -2381,7 +3157,6 @@
         <w:rPr>
           <w:rtl w:val="0"/>
         </w:rPr>
-        <w:t xml:space="preserve">Kafka supports three delivery guarantees, which define how reliably messages are delivered between producers and consumers. </w:t>
       </w:r>
     </w:p>
     <w:p>
@@ -2392,14 +3167,44 @@
         </w:numPr>
         <w:ind w:left="720" w:hanging="360"/>
         <w:rPr>
+          <w:b w:val="1"/>
+          <w:bCs w:val="1"/>
           <w:u w:val="none"/>
         </w:rPr>
       </w:pPr>
       <w:r>
         <w:rPr>
-          <w:rtl w:val="0"/>
-        </w:rPr>
-        <w:t xml:space="preserve">At Most Once (commits offset before processing), where messages may be lost but never duplicated; </w:t>
+          <w:b w:val="1"/>
+          <w:bCs w:val="1"/>
+          <w:rtl w:val="0"/>
+        </w:rPr>
+        <w:t xml:space="preserve">What happens internally when a topic is created?</w:t>
+      </w:r>
+    </w:p>
+    <w:p>
+      <w:pPr>
+        <w:ind w:left="0" w:firstLine="0"/>
+        <w:rPr/>
+      </w:pPr>
+      <w:r>
+        <w:rPr>
+          <w:rtl w:val="0"/>
+        </w:rPr>
+        <w:t xml:space="preserve">When a topic is created in Kafka, the request is handled by the kafka’s controller broker, which assigns partitions and their replicas across brokers. It then elects a leader for each partition and updates the cluster metadata. Finally, each broker creates the necessary log directories to store the data, and the updated metadata is propagated to all clients and brokers.</w:t>
+      </w:r>
+    </w:p>
+    <w:p>
+      <w:pPr>
+        <w:ind w:left="0" w:firstLine="0"/>
+        <w:rPr>
+          <w:b w:val="1"/>
+          <w:bCs w:val="1"/>
+        </w:rPr>
+      </w:pPr>
+      <w:r>
+        <w:rPr>
+          <w:rtl w:val="0"/>
+        </w:rPr>
       </w:r>
     </w:p>
     <w:p>
@@ -2410,14 +3215,29 @@
         </w:numPr>
         <w:ind w:left="720" w:hanging="360"/>
         <w:rPr>
+          <w:b w:val="1"/>
+          <w:bCs w:val="1"/>
           <w:u w:val="none"/>
         </w:rPr>
       </w:pPr>
       <w:r>
         <w:rPr>
-          <w:rtl w:val="0"/>
-        </w:rPr>
-        <w:t xml:space="preserve">At Least Once (commits offset after processing), where messages are not lost but may be processed multiple times; and </w:t>
+          <w:b w:val="1"/>
+          <w:bCs w:val="1"/>
+          <w:rtl w:val="0"/>
+        </w:rPr>
+        <w:t xml:space="preserve">What are the factors which help Kafka handling/achieving so many read and write operations?</w:t>
+      </w:r>
+    </w:p>
+    <w:p>
+      <w:pPr>
+        <w:ind w:left="0" w:firstLine="0"/>
+        <w:rPr/>
+      </w:pPr>
+      <w:r>
+        <w:rPr>
+          <w:rtl w:val="0"/>
+        </w:rPr>
       </w:r>
     </w:p>
     <w:p>
@@ -2428,14 +3248,18 @@
         </w:numPr>
         <w:ind w:left="720" w:hanging="360"/>
         <w:rPr>
+          <w:b w:val="1"/>
+          <w:bCs w:val="1"/>
           <w:u w:val="none"/>
         </w:rPr>
       </w:pPr>
       <w:r>
         <w:rPr>
-          <w:rtl w:val="0"/>
-        </w:rPr>
-        <w:t xml:space="preserve">Exactly Once, where messages are processed exactly once using idempotent producers and transactional guarantees. </w:t>
+          <w:b w:val="1"/>
+          <w:bCs w:val="1"/>
+          <w:rtl w:val="0"/>
+        </w:rPr>
+        <w:t xml:space="preserve">Pub-Sub v/s Kafka</w:t>
       </w:r>
     </w:p>
     <w:p>
@@ -2447,23 +3271,236 @@
         <w:rPr>
           <w:rtl w:val="0"/>
         </w:rPr>
+        <w:t xml:space="preserve">In Kafka, we use poll based mechanisms to get the events, whereas in the pub-sub model the publisher pushes the message onto the consumer. In the pub-sub model, once the message is pushed onto the consumer it is removed, whereas in Kafka the event persists even after it is consumed. So Message replay is possible in Kafka but not in pub-sub. One popular example of Pub-sub is redis pub-sub. Use Pub-sub for simple operations, where as Kafka should be used for complex stages.</w:t>
+      </w:r>
+    </w:p>
+    <w:p>
+      <w:pPr>
+        <w:numPr>
+          <w:ilvl w:val="0"/>
+          <w:numId w:val="5"/>
+        </w:numPr>
+        <w:ind w:left="720" w:hanging="360"/>
+        <w:rPr>
+          <w:b w:val="1"/>
+          <w:bCs w:val="1"/>
+        </w:rPr>
+      </w:pPr>
+      <w:r>
+        <w:rPr>
+          <w:b w:val="1"/>
+          <w:bCs w:val="1"/>
+          <w:rtl w:val="0"/>
+        </w:rPr>
+        <w:t xml:space="preserve">What are the different files that are stored in Kafka’s Partition and what are their roles and what each files contains?</w:t>
+      </w:r>
+    </w:p>
+    <w:p>
+      <w:pPr>
+        <w:rPr/>
+      </w:pPr>
+      <w:r>
+        <w:rPr>
+          <w:rtl w:val="0"/>
+        </w:rPr>
+      </w:r>
+    </w:p>
+    <w:p>
+      <w:pPr>
+        <w:rPr/>
+      </w:pPr>
+      <w:r>
+        <w:rPr>
+          <w:rtl w:val="0"/>
+        </w:rPr>
+        <w:t xml:space="preserve">Each partition is divided into multiple segment and each segment has multiple files.</w:t>
+      </w:r>
+    </w:p>
+    <w:p>
+      <w:pPr>
+        <w:rPr/>
+      </w:pPr>
+      <w:r>
+        <w:rPr>
+          <w:rtl w:val="0"/>
+        </w:rPr>
+      </w:r>
+    </w:p>
+    <w:p>
+      <w:pPr>
+        <w:rPr/>
+      </w:pPr>
+      <w:r>
+        <w:rPr>
+          <w:rtl w:val="0"/>
+        </w:rPr>
+        <w:t xml:space="preserve">orders-0/</w:t>
+      </w:r>
+    </w:p>
+    <w:p>
+      <w:pPr>
+        <w:rPr/>
+      </w:pPr>
+      <w:r>
+        <w:rPr>
+          <w:rtl w:val="0"/>
+        </w:rPr>
+        <w:t xml:space="preserve">│</w:t>
+      </w:r>
+    </w:p>
+    <w:p>
+      <w:pPr>
+        <w:rPr/>
+      </w:pPr>
+      <w:r>
+        <w:rPr>
+          <w:rtl w:val="0"/>
+        </w:rPr>
+        <w:t xml:space="preserve">├── 00000000000000000000.log</w:t>
+      </w:r>
+    </w:p>
+    <w:p>
+      <w:pPr>
+        <w:rPr/>
+      </w:pPr>
+      <w:r>
+        <w:rPr>
+          <w:rtl w:val="0"/>
+        </w:rPr>
+        <w:t xml:space="preserve">├── 00000000000000000000.index</w:t>
+      </w:r>
+    </w:p>
+    <w:p>
+      <w:pPr>
+        <w:rPr/>
+      </w:pPr>
+      <w:r>
+        <w:rPr>
+          <w:rtl w:val="0"/>
+        </w:rPr>
+        <w:t xml:space="preserve">├── 00000000000000000000.timeindex</w:t>
+      </w:r>
+    </w:p>
+    <w:p>
+      <w:pPr>
+        <w:rPr/>
+      </w:pPr>
+      <w:r>
+        <w:rPr>
+          <w:rtl w:val="0"/>
+        </w:rPr>
+        <w:t xml:space="preserve">│</w:t>
+      </w:r>
+    </w:p>
+    <w:p>
+      <w:pPr>
+        <w:rPr/>
+      </w:pPr>
+      <w:r>
+        <w:rPr>
+          <w:rtl w:val="0"/>
+        </w:rPr>
+        <w:t xml:space="preserve">├── 00000000000000001000.log</w:t>
+      </w:r>
+    </w:p>
+    <w:p>
+      <w:pPr>
+        <w:rPr/>
+      </w:pPr>
+      <w:r>
+        <w:rPr>
+          <w:rtl w:val="0"/>
+        </w:rPr>
+        <w:t xml:space="preserve">├── 00000000000000001000.index</w:t>
+      </w:r>
+    </w:p>
+    <w:p>
+      <w:pPr>
+        <w:rPr/>
+      </w:pPr>
+      <w:r>
+        <w:rPr>
+          <w:rtl w:val="0"/>
+        </w:rPr>
+        <w:t xml:space="preserve">├── 00000000000000001000.timeindex</w:t>
+      </w:r>
+    </w:p>
+    <w:p>
+      <w:pPr>
+        <w:rPr/>
+      </w:pPr>
+      <w:r>
+        <w:rPr>
+          <w:rtl w:val="0"/>
+        </w:rPr>
+        <w:t xml:space="preserve">│</w:t>
+      </w:r>
+    </w:p>
+    <w:p>
+      <w:pPr>
+        <w:rPr/>
+      </w:pPr>
+      <w:r>
+        <w:rPr>
+          <w:rtl w:val="0"/>
+        </w:rPr>
+        <w:t xml:space="preserve">├── 00000000000000002000.log</w:t>
+      </w:r>
+    </w:p>
+    <w:p>
+      <w:pPr>
+        <w:rPr/>
+      </w:pPr>
+      <w:r>
+        <w:rPr>
+          <w:rtl w:val="0"/>
+        </w:rPr>
+        <w:t xml:space="preserve">├── 00000000000000002000.index</w:t>
+      </w:r>
+    </w:p>
+    <w:p>
+      <w:pPr>
+        <w:rPr/>
+      </w:pPr>
+      <w:r>
+        <w:rPr>
+          <w:rtl w:val="0"/>
+        </w:rPr>
+        <w:t xml:space="preserve">├── 00000000000000002000.timeindex</w:t>
+      </w:r>
+    </w:p>
+    <w:p>
+      <w:pPr>
+        <w:rPr/>
+      </w:pPr>
+      <w:r>
+        <w:rPr>
+          <w:rtl w:val="0"/>
+        </w:rPr>
+        <w:t xml:space="preserve">│</w:t>
+      </w:r>
+    </w:p>
+    <w:p>
+      <w:pPr>
+        <w:rPr/>
+      </w:pPr>
+      <w:r>
+        <w:rPr>
+          <w:rtl w:val="0"/>
+        </w:rPr>
+        <w:t xml:space="preserve">├── leader-epoch-checkpoint</w:t>
       </w:r>
     </w:p>
     <w:p>
       <w:pPr>
         <w:ind w:left="0" w:firstLine="0"/>
-        <w:rPr>
-          <w:b w:val="1"/>
-          <w:bCs w:val="1"/>
-        </w:rPr>
-      </w:pPr>
-      <w:r>
-        <w:rPr>
-          <w:b w:val="1"/>
-          <w:bCs w:val="1"/>
-          <w:rtl w:val="0"/>
-        </w:rPr>
-        <w:t xml:space="preserve">What is Backpressure?</w:t>
+        <w:rPr/>
+      </w:pPr>
+      <w:r>
+        <w:rPr>
+          <w:rtl w:val="0"/>
+        </w:rPr>
+        <w:t xml:space="preserve">└── partition.metadata</w:t>
       </w:r>
     </w:p>
     <w:p>
@@ -2475,39 +3512,64 @@
         <w:rPr>
           <w:rtl w:val="0"/>
         </w:rPr>
-        <w:t xml:space="preserve">Backpressure occurs when consumers are unable to process events as fast as producers are sending them</w:t>
       </w:r>
     </w:p>
     <w:p>
       <w:pPr>
         <w:ind w:left="0" w:firstLine="0"/>
-        <w:rPr/>
-      </w:pPr>
-      <w:r>
-        <w:rPr>
-          <w:rtl w:val="0"/>
-        </w:rPr>
+        <w:rPr>
+          <w:i w:val="1"/>
+          <w:iCs w:val="1"/>
+        </w:rPr>
+      </w:pPr>
+      <w:r>
+        <w:rPr>
+          <w:i w:val="1"/>
+          <w:iCs w:val="1"/>
+          <w:rtl w:val="0"/>
+        </w:rPr>
+        <w:t xml:space="preserve">Note : Kafka does not have the concept of a globally "leader broker." Leadership is assigned at the partition level, not the broker level. A broker can host the leader replica for some partitions and follower replicas for others. When a producer wants to send data to a partition, it sends the message to the broker that currently hosts the leader replica of that specific partition. Similarly, consumers read from the leader replica of the partition assigned to them.</w:t>
       </w:r>
     </w:p>
     <w:p>
       <w:pPr>
         <w:ind w:left="0" w:firstLine="0"/>
         <w:rPr>
-          <w:b w:val="1"/>
-          <w:bCs w:val="1"/>
-        </w:rPr>
-      </w:pPr>
-      <w:r>
-        <w:rPr>
-          <w:b w:val="1"/>
-          <w:bCs w:val="1"/>
-          <w:rtl w:val="0"/>
-        </w:rPr>
-        <w:t xml:space="preserve">What happens internally when a topic is created?</w:t>
-      </w:r>
-    </w:p>
-    <w:p>
-      <w:pPr>
+          <w:i w:val="1"/>
+          <w:iCs w:val="1"/>
+        </w:rPr>
+      </w:pPr>
+      <w:r>
+        <w:rPr>
+          <w:rtl w:val="0"/>
+        </w:rPr>
+      </w:r>
+    </w:p>
+    <w:p>
+      <w:pPr>
+        <w:numPr>
+          <w:ilvl w:val="0"/>
+          <w:numId w:val="5"/>
+        </w:numPr>
+        <w:spacing w:after="240" w:lineRule="auto"/>
+        <w:ind w:left="720" w:hanging="360"/>
+        <w:rPr>
+          <w:b w:val="1"/>
+          <w:bCs w:val="1"/>
+        </w:rPr>
+      </w:pPr>
+      <w:r>
+        <w:rPr>
+          <w:b w:val="1"/>
+          <w:bCs w:val="1"/>
+          <w:rtl w:val="0"/>
+        </w:rPr>
+        <w:t xml:space="preserve">What is sticky partitioning?</w:t>
+      </w:r>
+    </w:p>
+    <w:p>
+      <w:pPr>
+        <w:spacing w:after="240" w:lineRule="auto"/>
         <w:ind w:left="0" w:firstLine="0"/>
         <w:rPr/>
       </w:pPr>
@@ -2515,38 +3577,156 @@
         <w:rPr>
           <w:rtl w:val="0"/>
         </w:rPr>
-        <w:t xml:space="preserve">When a topic is created in Kafka, the request is handled by the kafka’s controller broker, which assigns partitions and their replicas across brokers. It then elects a leader for each partition and updates the cluster metadata. Finally, each broker creates the necessary log directories to store the data, and the updated metadata is propagated to all clients and brokers.</w:t>
-      </w:r>
-    </w:p>
-    <w:p>
-      <w:pPr>
+        <w:t xml:space="preserve">It is the default partition assignment strategy which assigns partitions to events or messages without a key. In this strategy kafka directly sends events/messages to the same partition to build a larger batch. Once a batch is sent it chooses another partition to build.</w:t>
+      </w:r>
+    </w:p>
+    <w:p>
+      <w:pPr>
+        <w:numPr>
+          <w:ilvl w:val="0"/>
+          <w:numId w:val="5"/>
+        </w:numPr>
+        <w:spacing w:after="240" w:lineRule="auto"/>
+        <w:ind w:left="720" w:hanging="360"/>
+        <w:rPr>
+          <w:b w:val="1"/>
+          <w:bCs w:val="1"/>
+        </w:rPr>
+      </w:pPr>
+      <w:r>
+        <w:rPr>
+          <w:b w:val="1"/>
+          <w:bCs w:val="1"/>
+          <w:rtl w:val="0"/>
+        </w:rPr>
+        <w:t xml:space="preserve">What is the purpose of the message key in Kafka for choosing a partition?</w:t>
+      </w:r>
+    </w:p>
+    <w:p>
+      <w:pPr>
+        <w:spacing w:after="240" w:lineRule="auto"/>
         <w:ind w:left="0" w:firstLine="0"/>
-        <w:rPr>
-          <w:b w:val="1"/>
-          <w:bCs w:val="1"/>
-        </w:rPr>
-      </w:pPr>
-      <w:r>
-        <w:rPr>
-          <w:rtl w:val="0"/>
-        </w:rPr>
-      </w:r>
-    </w:p>
-    <w:p>
-      <w:pPr>
+        <w:rPr/>
+      </w:pPr>
+      <w:r>
+        <w:rPr>
+          <w:rtl w:val="0"/>
+        </w:rPr>
+        <w:t xml:space="preserve">The purpose of a message key in Kafka is to group related events together in the same partition.</w:t>
+      </w:r>
+      <w:r>
+        <w:rPr>
+          <w:b w:val="1"/>
+          <w:bCs w:val="1"/>
+          <w:rtl w:val="0"/>
+        </w:rPr>
+        <w:t xml:space="preserve"> </w:t>
+      </w:r>
+      <w:r>
+        <w:rPr>
+          <w:rtl w:val="0"/>
+        </w:rPr>
+        <w:t xml:space="preserve">Events/Messages with same key will go to same partition.</w:t>
+      </w:r>
+    </w:p>
+    <w:p>
+      <w:pPr>
+        <w:numPr>
+          <w:ilvl w:val="0"/>
+          <w:numId w:val="5"/>
+        </w:numPr>
+        <w:spacing w:after="240" w:lineRule="auto"/>
+        <w:ind w:left="720" w:hanging="360"/>
+        <w:rPr>
+          <w:b w:val="1"/>
+          <w:bCs w:val="1"/>
+        </w:rPr>
+      </w:pPr>
+      <w:r>
+        <w:rPr>
+          <w:b w:val="1"/>
+          <w:bCs w:val="1"/>
+          <w:rtl w:val="0"/>
+        </w:rPr>
+        <w:t xml:space="preserve">How does a producer know to which broker and partition it should write?</w:t>
+      </w:r>
+    </w:p>
+    <w:p>
+      <w:pPr>
+        <w:spacing w:after="240" w:lineRule="auto"/>
+        <w:rPr/>
+      </w:pPr>
+      <w:r>
+        <w:rPr>
+          <w:rtl w:val="0"/>
+        </w:rPr>
+        <w:t xml:space="preserve">Initially the producer only knows the topic to which it has to write the event.</w:t>
+        <w:br w:type="textWrapping"/>
+        <w:t xml:space="preserve">It does not know to which broker or to which partition it has to write the event.</w:t>
+        <w:br w:type="textWrapping"/>
+        <w:t xml:space="preserve">But the Producer does know about the bootstrap server. Bootstrap servers are the brokers used to establish the initial connection. They are configured with the producer when the producer is created.</w:t>
+        <w:br w:type="textWrapping"/>
+        <w:t xml:space="preserve">The producer contacts one of these bootstrap servers and requests metadata for the topic. The metadata contains the list of partitions and the leader broker for each partition.</w:t>
+        <w:br w:type="textWrapping"/>
+        <w:t xml:space="preserve">The producer caches this metadata locally.</w:t>
+        <w:br w:type="textWrapping"/>
+        <w:t xml:space="preserve">Once we have a metadata, the producer sends the message directly to the leader broker of that partition. The leader broker then replicates the message to its follower replicas.</w:t>
+      </w:r>
+    </w:p>
+    <w:p>
+      <w:pPr>
+        <w:numPr>
+          <w:ilvl w:val="0"/>
+          <w:numId w:val="5"/>
+        </w:numPr>
+        <w:spacing w:after="240" w:lineRule="auto"/>
+        <w:ind w:left="720" w:hanging="360"/>
+        <w:rPr>
+          <w:b w:val="1"/>
+          <w:bCs w:val="1"/>
+        </w:rPr>
+      </w:pPr>
+      <w:r>
+        <w:rPr>
+          <w:b w:val="1"/>
+          <w:bCs w:val="1"/>
+          <w:rtl w:val="0"/>
+        </w:rPr>
+        <w:t xml:space="preserve">How does the consumer know where to read from?</w:t>
+      </w:r>
+    </w:p>
+    <w:p>
+      <w:pPr>
+        <w:spacing w:after="240" w:lineRule="auto"/>
         <w:ind w:left="0" w:firstLine="0"/>
-        <w:rPr>
-          <w:b w:val="1"/>
-          <w:bCs w:val="1"/>
-        </w:rPr>
-      </w:pPr>
-      <w:r>
-        <w:rPr>
-          <w:b w:val="1"/>
-          <w:bCs w:val="1"/>
-          <w:rtl w:val="0"/>
-        </w:rPr>
-        <w:t xml:space="preserve">What are the factors which help Kafka handling/achieving so many read and write operations?</w:t>
+        <w:rPr/>
+      </w:pPr>
+      <w:r>
+        <w:rPr>
+          <w:rtl w:val="0"/>
+        </w:rPr>
+        <w:t xml:space="preserve">The consumer also starts by connecting to one of the bootstrap servers to fetch cluster metadata. If it belongs to a consumer group, it joins the group and a group coordinator assigns partitions to it. The consumer retrieves the last committed offset for its assigned partitions from Kafka's __consumer_offsets topic. Using the metadata, it identifies the leader broker for each assigned partition and reads messages directly from those leader partitions, starting from the committed offset.</w:t>
+      </w:r>
+    </w:p>
+    <w:p>
+      <w:pPr>
+        <w:numPr>
+          <w:ilvl w:val="0"/>
+          <w:numId w:val="5"/>
+        </w:numPr>
+        <w:ind w:left="720" w:hanging="360"/>
+        <w:rPr>
+          <w:b w:val="1"/>
+          <w:bCs w:val="1"/>
+        </w:rPr>
+      </w:pPr>
+      <w:r>
+        <w:rPr>
+          <w:b w:val="1"/>
+          <w:bCs w:val="1"/>
+          <w:rtl w:val="0"/>
+        </w:rPr>
+        <w:t xml:space="preserve">Suppose we have a consumer group with 5 consumers. Now 2 consumer from same partition want to read data from a partition. Can it happen that consumer 1 read from partition 1 and consumer 2 read from partition 2, Where partition 2 is replica of partition 1? </w:t>
       </w:r>
     </w:p>
     <w:p>
@@ -2558,6 +3738,7 @@
         <w:rPr>
           <w:rtl w:val="0"/>
         </w:rPr>
+        <w:t xml:space="preserve">No, that cannot happen. Within the same consumer group, Kafka guarantees that a partition (and all its in-sync replicas) is assigned to exactly one consumer instance so as to prevent duplicate processing.</w:t>
       </w:r>
     </w:p>
     <w:p>
@@ -2573,19 +3754,36 @@
     </w:p>
     <w:p>
       <w:pPr>
+        <w:numPr>
+          <w:ilvl w:val="0"/>
+          <w:numId w:val="5"/>
+        </w:numPr>
+        <w:ind w:left="720" w:hanging="360"/>
+        <w:rPr>
+          <w:b w:val="1"/>
+          <w:bCs w:val="1"/>
+          <w:u w:val="none"/>
+        </w:rPr>
+      </w:pPr>
+      <w:r>
+        <w:rPr>
+          <w:b w:val="1"/>
+          <w:bCs w:val="1"/>
+          <w:rtl w:val="0"/>
+        </w:rPr>
+        <w:t xml:space="preserve">What are in-sync replicas (ISR)?</w:t>
+      </w:r>
+    </w:p>
+    <w:p>
+      <w:pPr>
         <w:ind w:left="0" w:firstLine="0"/>
-        <w:rPr>
-          <w:b w:val="1"/>
-          <w:bCs w:val="1"/>
-        </w:rPr>
-      </w:pPr>
-      <w:r>
-        <w:rPr>
-          <w:b w:val="1"/>
-          <w:bCs w:val="1"/>
-          <w:rtl w:val="0"/>
-        </w:rPr>
-        <w:t xml:space="preserve">Pub-Sub v/s Kafka</w:t>
+        <w:rPr/>
+      </w:pPr>
+      <w:r>
+        <w:rPr>
+          <w:rtl w:val="0"/>
+        </w:rPr>
+        <w:t xml:space="preserve">They are a set of follower replicas, which are in sync with leader replicas and are eligible to become leader replica, if the leader replica goes down.</w:t>
       </w:r>
     </w:p>
     <w:p>
@@ -2597,7 +3795,39 @@
         <w:rPr>
           <w:rtl w:val="0"/>
         </w:rPr>
-        <w:t xml:space="preserve">In Kafka, we use poll based mechanisms to get the events, whereas in the pub-sub model the publisher pushes the message onto the consumer. In the pub-sub model, once the message is pushed onto the consumer it is removed, whereas in Kafka the event persists even after it is consumed. So Message replay is possible in Kafka but not in pub-sub. One popular example of Pub-sub is redis pub-sub. Use Pub-sub for simple operations, where as Kafka should be used for complex stages.</w:t>
+      </w:r>
+    </w:p>
+    <w:p>
+      <w:pPr>
+        <w:numPr>
+          <w:ilvl w:val="0"/>
+          <w:numId w:val="5"/>
+        </w:numPr>
+        <w:ind w:left="720" w:hanging="360"/>
+        <w:rPr>
+          <w:b w:val="1"/>
+          <w:bCs w:val="1"/>
+          <w:u w:val="none"/>
+        </w:rPr>
+      </w:pPr>
+      <w:r>
+        <w:rPr>
+          <w:b w:val="1"/>
+          <w:bCs w:val="1"/>
+          <w:rtl w:val="0"/>
+        </w:rPr>
+        <w:t xml:space="preserve">Message Size in Kafka.</w:t>
+      </w:r>
+    </w:p>
+    <w:p>
+      <w:pPr>
+        <w:rPr/>
+      </w:pPr>
+      <w:r>
+        <w:rPr>
+          <w:rtl w:val="0"/>
+        </w:rPr>
+        <w:t xml:space="preserve">Kafka does not allow unlimited message sizes.</w:t>
       </w:r>
     </w:p>
     <w:p>
@@ -2609,14 +3839,150 @@
         <w:rPr>
           <w:rtl w:val="0"/>
         </w:rPr>
+        <w:t xml:space="preserve">By default, Maximum message size = 1 MB.</w:t>
       </w:r>
     </w:p>
     <w:p>
       <w:pPr>
         <w:ind w:left="0" w:firstLine="0"/>
-        <w:rPr>
-          <w:b w:val="1"/>
-          <w:bCs w:val="1"/>
+        <w:rPr/>
+      </w:pPr>
+      <w:r>
+        <w:rPr>
+          <w:rtl w:val="0"/>
+        </w:rPr>
+      </w:r>
+    </w:p>
+    <w:p>
+      <w:pPr>
+        <w:numPr>
+          <w:ilvl w:val="0"/>
+          <w:numId w:val="5"/>
+        </w:numPr>
+        <w:ind w:left="720" w:hanging="360"/>
+        <w:rPr>
+          <w:b w:val="1"/>
+          <w:bCs w:val="1"/>
+          <w:u w:val="none"/>
+        </w:rPr>
+      </w:pPr>
+      <w:r>
+        <w:rPr>
+          <w:b w:val="1"/>
+          <w:bCs w:val="1"/>
+          <w:rtl w:val="0"/>
+        </w:rPr>
+        <w:t xml:space="preserve">What happens when a Producer sends a message that is greater than maximum message size?</w:t>
+      </w:r>
+    </w:p>
+    <w:p>
+      <w:pPr>
+        <w:rPr/>
+      </w:pPr>
+      <w:r>
+        <w:rPr>
+          <w:rtl w:val="0"/>
+        </w:rPr>
+        <w:t xml:space="preserve">Kafka throws RecordTooLargeException</w:t>
+      </w:r>
+    </w:p>
+    <w:p>
+      <w:pPr>
+        <w:rPr/>
+      </w:pPr>
+      <w:r>
+        <w:rPr>
+          <w:rtl w:val="0"/>
+        </w:rPr>
+        <w:t xml:space="preserve">Does Kafka Split Large Messages (A very common interview question.)?</w:t>
+      </w:r>
+    </w:p>
+    <w:p>
+      <w:pPr>
+        <w:rPr/>
+      </w:pPr>
+      <w:r>
+        <w:rPr>
+          <w:rtl w:val="0"/>
+        </w:rPr>
+        <w:t xml:space="preserve">Answer: No.</w:t>
+      </w:r>
+    </w:p>
+    <w:p>
+      <w:pPr>
+        <w:rPr/>
+      </w:pPr>
+      <w:r>
+        <w:rPr>
+          <w:rtl w:val="0"/>
+        </w:rPr>
+        <w:t xml:space="preserve">Kafka treats a message as an atomic record.</w:t>
+      </w:r>
+    </w:p>
+    <w:p>
+      <w:pPr>
+        <w:rPr/>
+      </w:pPr>
+      <w:r>
+        <w:rPr>
+          <w:rtl w:val="0"/>
+        </w:rPr>
+      </w:r>
+    </w:p>
+    <w:p>
+      <w:pPr>
+        <w:rPr/>
+      </w:pPr>
+      <w:r>
+        <w:rPr>
+          <w:rtl w:val="0"/>
+        </w:rPr>
+        <w:t xml:space="preserve">Suppose we send 10 MB then: Kafka does not split it into chunks of 1 MB</w:t>
+      </w:r>
+    </w:p>
+    <w:p>
+      <w:pPr>
+        <w:rPr/>
+      </w:pPr>
+      <w:r>
+        <w:rPr>
+          <w:rtl w:val="0"/>
+        </w:rPr>
+      </w:r>
+    </w:p>
+    <w:p>
+      <w:pPr>
+        <w:rPr/>
+      </w:pPr>
+      <w:r>
+        <w:rPr>
+          <w:rtl w:val="0"/>
+        </w:rPr>
+        <w:t xml:space="preserve">It either: accepts the whole message, or rejects the whole message.</w:t>
+      </w:r>
+    </w:p>
+    <w:p>
+      <w:pPr>
+        <w:ind w:left="0" w:firstLine="0"/>
+        <w:rPr/>
+      </w:pPr>
+      <w:r>
+        <w:rPr>
+          <w:rtl w:val="0"/>
+        </w:rPr>
+      </w:r>
+    </w:p>
+    <w:p>
+      <w:pPr>
+        <w:numPr>
+          <w:ilvl w:val="0"/>
+          <w:numId w:val="5"/>
+        </w:numPr>
+        <w:ind w:left="720" w:hanging="360"/>
+        <w:rPr>
+          <w:b w:val="1"/>
+          <w:bCs w:val="1"/>
+          <w:u w:val="none"/>
         </w:rPr>
       </w:pPr>
       <w:r>
@@ -2649,6 +4015,312 @@
         <w:rPr>
           <w:rtl w:val="0"/>
         </w:rPr>
+      </w:r>
+    </w:p>
+    <w:p>
+      <w:pPr>
+        <w:ind w:left="0" w:firstLine="0"/>
+        <w:rPr/>
+      </w:pPr>
+      <w:r>
+        <w:rPr>
+          <w:rtl w:val="0"/>
+        </w:rPr>
+        <w:t xml:space="preserve">Note: Kafka uses a pull model instead of a push model. Which means the consumer receives the data only when it requests it. Hence in this it becomes very important to monitor consumer lag. Consumer lag is a very important monitoring metric.Higher consumer lag means, the consumer is not able to read as fast as the events/messages are being produced.</w:t>
+      </w:r>
+    </w:p>
+    <w:p>
+      <w:pPr>
+        <w:ind w:left="0" w:firstLine="0"/>
+        <w:rPr/>
+      </w:pPr>
+      <w:r>
+        <w:rPr>
+          <w:rtl w:val="0"/>
+        </w:rPr>
+      </w:r>
+    </w:p>
+    <w:p>
+      <w:pPr>
+        <w:ind w:left="0" w:firstLine="0"/>
+        <w:rPr/>
+      </w:pPr>
+      <w:r>
+        <w:rPr>
+          <w:rtl w:val="0"/>
+        </w:rPr>
+        <w:t xml:space="preserve">Replication Questions</w:t>
+      </w:r>
+    </w:p>
+    <w:p>
+      <w:pPr>
+        <w:pStyle w:val="Heading4"/>
+        <w:keepNext w:val="0"/>
+        <w:keepLines w:val="0"/>
+        <w:spacing w:after="40" w:before="240" w:lineRule="auto"/>
+        <w:rPr>
+          <w:b w:val="1"/>
+          <w:bCs w:val="1"/>
+          <w:color w:val="000000"/>
+          <w:sz w:val="22"/>
+          <w:szCs w:val="22"/>
+        </w:rPr>
+      </w:pPr>
+      <w:bookmarkStart w:colFirst="0" w:colLast="0" w:name="_heading=h.bxswud7i94wd" w:id="0"/>
+      <w:bookmarkEnd w:id="0"/>
+      <w:r>
+        <w:rPr>
+          <w:b w:val="1"/>
+          <w:bCs w:val="1"/>
+          <w:color w:val="000000"/>
+          <w:sz w:val="22"/>
+          <w:szCs w:val="22"/>
+          <w:rtl w:val="0"/>
+        </w:rPr>
+        <w:t xml:space="preserve">Where will my data be replicated?</w:t>
+      </w:r>
+    </w:p>
+    <w:p>
+      <w:pPr>
+        <w:spacing w:after="240" w:before="240" w:lineRule="auto"/>
+        <w:rPr/>
+      </w:pPr>
+      <w:r>
+        <w:rPr>
+          <w:rtl w:val="0"/>
+        </w:rPr>
+        <w:t xml:space="preserve">Your data is replicated </w:t>
+      </w:r>
+      <w:r>
+        <w:rPr>
+          <w:b w:val="1"/>
+          <w:bCs w:val="1"/>
+          <w:rtl w:val="0"/>
+        </w:rPr>
+        <w:t xml:space="preserve">across different Brokers via Partition Replicas</w:t>
+      </w:r>
+      <w:r>
+        <w:rPr>
+          <w:rtl w:val="0"/>
+        </w:rPr>
+        <w:t xml:space="preserve">.</w:t>
+      </w:r>
+    </w:p>
+    <w:p>
+      <w:pPr>
+        <w:spacing w:after="240" w:before="240" w:lineRule="auto"/>
+        <w:rPr/>
+      </w:pPr>
+      <w:r>
+        <w:rPr>
+          <w:rtl w:val="0"/>
+        </w:rPr>
+        <w:t xml:space="preserve">When a partition is created, Kafka creates copies of it (called </w:t>
+      </w:r>
+      <w:r>
+        <w:rPr>
+          <w:b w:val="1"/>
+          <w:bCs w:val="1"/>
+          <w:rtl w:val="0"/>
+        </w:rPr>
+        <w:t xml:space="preserve">Replicas</w:t>
+      </w:r>
+      <w:r>
+        <w:rPr>
+          <w:rtl w:val="0"/>
+        </w:rPr>
+        <w:t xml:space="preserve">) and intentionally scatters them across </w:t>
+      </w:r>
+      <w:r>
+        <w:rPr>
+          <w:b w:val="1"/>
+          <w:bCs w:val="1"/>
+          <w:rtl w:val="0"/>
+        </w:rPr>
+        <w:t xml:space="preserve">different physical brokers</w:t>
+      </w:r>
+      <w:r>
+        <w:rPr>
+          <w:rtl w:val="0"/>
+        </w:rPr>
+        <w:t xml:space="preserve"> in the cluster. This ensures that if one broker goes down, another broker holding a copy of that partition can take over.</w:t>
+      </w:r>
+    </w:p>
+    <w:p>
+      <w:pPr>
+        <w:spacing w:after="240" w:before="240" w:lineRule="auto"/>
+        <w:rPr>
+          <w:b w:val="1"/>
+          <w:bCs w:val="1"/>
+          <w:color w:val="000000"/>
+          <w:sz w:val="22"/>
+          <w:szCs w:val="22"/>
+        </w:rPr>
+      </w:pPr>
+      <w:r>
+        <w:rPr>
+          <w:b w:val="1"/>
+          <w:bCs w:val="1"/>
+          <w:color w:val="000000"/>
+          <w:sz w:val="22"/>
+          <w:szCs w:val="22"/>
+          <w:rtl w:val="0"/>
+        </w:rPr>
+        <w:t xml:space="preserve">How many additional instances of my data will be created?</w:t>
+      </w:r>
+    </w:p>
+    <w:p>
+      <w:pPr>
+        <w:spacing w:after="240" w:before="240" w:lineRule="auto"/>
+        <w:rPr/>
+      </w:pPr>
+      <w:r>
+        <w:rPr>
+          <w:rtl w:val="0"/>
+        </w:rPr>
+        <w:t xml:space="preserve">This is entirely controlled by a setting you define called the </w:t>
+      </w:r>
+      <w:r>
+        <w:rPr>
+          <w:b w:val="1"/>
+          <w:bCs w:val="1"/>
+          <w:rtl w:val="0"/>
+        </w:rPr>
+        <w:t xml:space="preserve">Replication Factor</w:t>
+      </w:r>
+      <w:r>
+        <w:rPr>
+          <w:rtl w:val="0"/>
+        </w:rPr>
+        <w:t xml:space="preserve">.</w:t>
+      </w:r>
+    </w:p>
+    <w:p>
+      <w:pPr>
+        <w:numPr>
+          <w:ilvl w:val="0"/>
+          <w:numId w:val="4"/>
+        </w:numPr>
+        <w:spacing w:after="0" w:afterAutospacing="0" w:before="240" w:lineRule="auto"/>
+        <w:ind w:left="720" w:hanging="360"/>
+      </w:pPr>
+      <w:r>
+        <w:rPr>
+          <w:rtl w:val="0"/>
+        </w:rPr>
+        <w:t xml:space="preserve">If your </w:t>
+      </w:r>
+      <w:r>
+        <w:rPr>
+          <w:b w:val="1"/>
+          <w:bCs w:val="1"/>
+          <w:rtl w:val="0"/>
+        </w:rPr>
+        <w:t xml:space="preserve">Replication Factor = 1</w:t>
+      </w:r>
+      <w:r>
+        <w:rPr>
+          <w:rtl w:val="0"/>
+        </w:rPr>
+        <w:t xml:space="preserve">: There is only </w:t>
+      </w:r>
+      <w:r>
+        <w:rPr>
+          <w:b w:val="1"/>
+          <w:bCs w:val="1"/>
+          <w:rtl w:val="0"/>
+        </w:rPr>
+        <w:t xml:space="preserve">1 instance</w:t>
+      </w:r>
+      <w:r>
+        <w:rPr>
+          <w:rtl w:val="0"/>
+        </w:rPr>
+        <w:t xml:space="preserve"> of your data (the Leader). There are </w:t>
+      </w:r>
+      <w:r>
+        <w:rPr>
+          <w:b w:val="1"/>
+          <w:bCs w:val="1"/>
+          <w:rtl w:val="0"/>
+        </w:rPr>
+        <w:t xml:space="preserve">0 additional copies</w:t>
+      </w:r>
+      <w:r>
+        <w:rPr>
+          <w:rtl w:val="0"/>
+        </w:rPr>
+        <w:t xml:space="preserve">. If that broker dies, your data is unavailable.</w:t>
+      </w:r>
+    </w:p>
+    <w:p>
+      <w:pPr>
+        <w:numPr>
+          <w:ilvl w:val="0"/>
+          <w:numId w:val="4"/>
+        </w:numPr>
+        <w:spacing w:after="240" w:before="0" w:beforeAutospacing="0" w:lineRule="auto"/>
+        <w:ind w:left="720" w:hanging="360"/>
+      </w:pPr>
+      <w:r>
+        <w:rPr>
+          <w:rtl w:val="0"/>
+        </w:rPr>
+        <w:t xml:space="preserve">If your </w:t>
+      </w:r>
+      <w:r>
+        <w:rPr>
+          <w:b w:val="1"/>
+          <w:bCs w:val="1"/>
+          <w:rtl w:val="0"/>
+        </w:rPr>
+        <w:t xml:space="preserve">Replication Factor = 3</w:t>
+      </w:r>
+      <w:r>
+        <w:rPr>
+          <w:rtl w:val="0"/>
+        </w:rPr>
+        <w:t xml:space="preserve"> (Industry Standard): There will be </w:t>
+      </w:r>
+      <w:r>
+        <w:rPr>
+          <w:b w:val="1"/>
+          <w:bCs w:val="1"/>
+          <w:rtl w:val="0"/>
+        </w:rPr>
+        <w:t xml:space="preserve">3 instances</w:t>
+      </w:r>
+      <w:r>
+        <w:rPr>
+          <w:rtl w:val="0"/>
+        </w:rPr>
+        <w:t xml:space="preserve"> of your data in total. That means </w:t>
+      </w:r>
+      <w:r>
+        <w:rPr>
+          <w:b w:val="1"/>
+          <w:bCs w:val="1"/>
+          <w:rtl w:val="0"/>
+        </w:rPr>
+        <w:t xml:space="preserve">1 Leader instance + 2 additional Follower instances</w:t>
+      </w:r>
+      <w:r>
+        <w:rPr>
+          <w:rtl w:val="0"/>
+        </w:rPr>
+        <w:t xml:space="preserve">.</w:t>
+      </w:r>
+    </w:p>
+    <w:p>
+      <w:pPr>
+        <w:ind w:left="0" w:firstLine="0"/>
+        <w:rPr/>
+      </w:pPr>
+      <w:r>
+        <w:rPr>
+          <w:rtl w:val="0"/>
+        </w:rPr>
+        <w:t xml:space="preserve">WHat happens when a cluster goes down? What are the chances of this thing to happen?</w:t>
       </w:r>
     </w:p>
     <w:p>
@@ -2698,6 +4370,226 @@
   <w:abstractNum w:abstractNumId="1">
     <w:lvl w:ilvl="0">
       <w:start w:val="1"/>
+      <w:numFmt w:val="bullet"/>
+      <w:lvlText w:val="●"/>
+      <w:lvlJc w:val="left"/>
+      <w:pPr>
+        <w:ind w:left="720" w:hanging="360"/>
+      </w:pPr>
+      <w:rPr>
+        <w:u w:val="none"/>
+      </w:rPr>
+    </w:lvl>
+    <w:lvl w:ilvl="1">
+      <w:start w:val="1"/>
+      <w:numFmt w:val="bullet"/>
+      <w:lvlText w:val="○"/>
+      <w:lvlJc w:val="left"/>
+      <w:pPr>
+        <w:ind w:left="1440" w:hanging="360"/>
+      </w:pPr>
+      <w:rPr>
+        <w:u w:val="none"/>
+      </w:rPr>
+    </w:lvl>
+    <w:lvl w:ilvl="2">
+      <w:start w:val="1"/>
+      <w:numFmt w:val="bullet"/>
+      <w:lvlText w:val="■"/>
+      <w:lvlJc w:val="left"/>
+      <w:pPr>
+        <w:ind w:left="2160" w:hanging="360"/>
+      </w:pPr>
+      <w:rPr>
+        <w:u w:val="none"/>
+      </w:rPr>
+    </w:lvl>
+    <w:lvl w:ilvl="3">
+      <w:start w:val="1"/>
+      <w:numFmt w:val="bullet"/>
+      <w:lvlText w:val="●"/>
+      <w:lvlJc w:val="left"/>
+      <w:pPr>
+        <w:ind w:left="2880" w:hanging="360"/>
+      </w:pPr>
+      <w:rPr>
+        <w:u w:val="none"/>
+      </w:rPr>
+    </w:lvl>
+    <w:lvl w:ilvl="4">
+      <w:start w:val="1"/>
+      <w:numFmt w:val="bullet"/>
+      <w:lvlText w:val="○"/>
+      <w:lvlJc w:val="left"/>
+      <w:pPr>
+        <w:ind w:left="3600" w:hanging="360"/>
+      </w:pPr>
+      <w:rPr>
+        <w:u w:val="none"/>
+      </w:rPr>
+    </w:lvl>
+    <w:lvl w:ilvl="5">
+      <w:start w:val="1"/>
+      <w:numFmt w:val="bullet"/>
+      <w:lvlText w:val="■"/>
+      <w:lvlJc w:val="left"/>
+      <w:pPr>
+        <w:ind w:left="4320" w:hanging="360"/>
+      </w:pPr>
+      <w:rPr>
+        <w:u w:val="none"/>
+      </w:rPr>
+    </w:lvl>
+    <w:lvl w:ilvl="6">
+      <w:start w:val="1"/>
+      <w:numFmt w:val="bullet"/>
+      <w:lvlText w:val="●"/>
+      <w:lvlJc w:val="left"/>
+      <w:pPr>
+        <w:ind w:left="5040" w:hanging="360"/>
+      </w:pPr>
+      <w:rPr>
+        <w:u w:val="none"/>
+      </w:rPr>
+    </w:lvl>
+    <w:lvl w:ilvl="7">
+      <w:start w:val="1"/>
+      <w:numFmt w:val="bullet"/>
+      <w:lvlText w:val="○"/>
+      <w:lvlJc w:val="left"/>
+      <w:pPr>
+        <w:ind w:left="5760" w:hanging="360"/>
+      </w:pPr>
+      <w:rPr>
+        <w:u w:val="none"/>
+      </w:rPr>
+    </w:lvl>
+    <w:lvl w:ilvl="8">
+      <w:start w:val="1"/>
+      <w:numFmt w:val="bullet"/>
+      <w:lvlText w:val="■"/>
+      <w:lvlJc w:val="left"/>
+      <w:pPr>
+        <w:ind w:left="6480" w:hanging="360"/>
+      </w:pPr>
+      <w:rPr>
+        <w:u w:val="none"/>
+      </w:rPr>
+    </w:lvl>
+  </w:abstractNum>
+  <w:abstractNum w:abstractNumId="2">
+    <w:lvl w:ilvl="0">
+      <w:start w:val="1"/>
+      <w:numFmt w:val="bullet"/>
+      <w:lvlText w:val="●"/>
+      <w:lvlJc w:val="left"/>
+      <w:pPr>
+        <w:ind w:left="720" w:hanging="360"/>
+      </w:pPr>
+      <w:rPr>
+        <w:u w:val="none"/>
+      </w:rPr>
+    </w:lvl>
+    <w:lvl w:ilvl="1">
+      <w:start w:val="1"/>
+      <w:numFmt w:val="bullet"/>
+      <w:lvlText w:val="○"/>
+      <w:lvlJc w:val="left"/>
+      <w:pPr>
+        <w:ind w:left="1440" w:hanging="360"/>
+      </w:pPr>
+      <w:rPr>
+        <w:u w:val="none"/>
+      </w:rPr>
+    </w:lvl>
+    <w:lvl w:ilvl="2">
+      <w:start w:val="1"/>
+      <w:numFmt w:val="bullet"/>
+      <w:lvlText w:val="■"/>
+      <w:lvlJc w:val="left"/>
+      <w:pPr>
+        <w:ind w:left="2160" w:hanging="360"/>
+      </w:pPr>
+      <w:rPr>
+        <w:u w:val="none"/>
+      </w:rPr>
+    </w:lvl>
+    <w:lvl w:ilvl="3">
+      <w:start w:val="1"/>
+      <w:numFmt w:val="bullet"/>
+      <w:lvlText w:val="●"/>
+      <w:lvlJc w:val="left"/>
+      <w:pPr>
+        <w:ind w:left="2880" w:hanging="360"/>
+      </w:pPr>
+      <w:rPr>
+        <w:u w:val="none"/>
+      </w:rPr>
+    </w:lvl>
+    <w:lvl w:ilvl="4">
+      <w:start w:val="1"/>
+      <w:numFmt w:val="bullet"/>
+      <w:lvlText w:val="○"/>
+      <w:lvlJc w:val="left"/>
+      <w:pPr>
+        <w:ind w:left="3600" w:hanging="360"/>
+      </w:pPr>
+      <w:rPr>
+        <w:u w:val="none"/>
+      </w:rPr>
+    </w:lvl>
+    <w:lvl w:ilvl="5">
+      <w:start w:val="1"/>
+      <w:numFmt w:val="bullet"/>
+      <w:lvlText w:val="■"/>
+      <w:lvlJc w:val="left"/>
+      <w:pPr>
+        <w:ind w:left="4320" w:hanging="360"/>
+      </w:pPr>
+      <w:rPr>
+        <w:u w:val="none"/>
+      </w:rPr>
+    </w:lvl>
+    <w:lvl w:ilvl="6">
+      <w:start w:val="1"/>
+      <w:numFmt w:val="bullet"/>
+      <w:lvlText w:val="●"/>
+      <w:lvlJc w:val="left"/>
+      <w:pPr>
+        <w:ind w:left="5040" w:hanging="360"/>
+      </w:pPr>
+      <w:rPr>
+        <w:u w:val="none"/>
+      </w:rPr>
+    </w:lvl>
+    <w:lvl w:ilvl="7">
+      <w:start w:val="1"/>
+      <w:numFmt w:val="bullet"/>
+      <w:lvlText w:val="○"/>
+      <w:lvlJc w:val="left"/>
+      <w:pPr>
+        <w:ind w:left="5760" w:hanging="360"/>
+      </w:pPr>
+      <w:rPr>
+        <w:u w:val="none"/>
+      </w:rPr>
+    </w:lvl>
+    <w:lvl w:ilvl="8">
+      <w:start w:val="1"/>
+      <w:numFmt w:val="bullet"/>
+      <w:lvlText w:val="■"/>
+      <w:lvlJc w:val="left"/>
+      <w:pPr>
+        <w:ind w:left="6480" w:hanging="360"/>
+      </w:pPr>
+      <w:rPr>
+        <w:u w:val="none"/>
+      </w:rPr>
+    </w:lvl>
+  </w:abstractNum>
+  <w:abstractNum w:abstractNumId="3">
+    <w:lvl w:ilvl="0">
+      <w:start w:val="1"/>
       <w:numFmt w:val="decimal"/>
       <w:lvlText w:val="%1."/>
       <w:lvlJc w:val="left"/>
@@ -2805,7 +4697,117 @@
       </w:rPr>
     </w:lvl>
   </w:abstractNum>
-  <w:abstractNum w:abstractNumId="2">
+  <w:abstractNum w:abstractNumId="4">
+    <w:lvl w:ilvl="0">
+      <w:start w:val="1"/>
+      <w:numFmt w:val="bullet"/>
+      <w:lvlText w:val="●"/>
+      <w:lvlJc w:val="left"/>
+      <w:pPr>
+        <w:ind w:left="720" w:hanging="360"/>
+      </w:pPr>
+      <w:rPr>
+        <w:u w:val="none"/>
+      </w:rPr>
+    </w:lvl>
+    <w:lvl w:ilvl="1">
+      <w:start w:val="1"/>
+      <w:numFmt w:val="bullet"/>
+      <w:lvlText w:val="○"/>
+      <w:lvlJc w:val="left"/>
+      <w:pPr>
+        <w:ind w:left="1440" w:hanging="360"/>
+      </w:pPr>
+      <w:rPr>
+        <w:u w:val="none"/>
+      </w:rPr>
+    </w:lvl>
+    <w:lvl w:ilvl="2">
+      <w:start w:val="1"/>
+      <w:numFmt w:val="bullet"/>
+      <w:lvlText w:val="■"/>
+      <w:lvlJc w:val="left"/>
+      <w:pPr>
+        <w:ind w:left="2160" w:hanging="360"/>
+      </w:pPr>
+      <w:rPr>
+        <w:u w:val="none"/>
+      </w:rPr>
+    </w:lvl>
+    <w:lvl w:ilvl="3">
+      <w:start w:val="1"/>
+      <w:numFmt w:val="bullet"/>
+      <w:lvlText w:val="●"/>
+      <w:lvlJc w:val="left"/>
+      <w:pPr>
+        <w:ind w:left="2880" w:hanging="360"/>
+      </w:pPr>
+      <w:rPr>
+        <w:u w:val="none"/>
+      </w:rPr>
+    </w:lvl>
+    <w:lvl w:ilvl="4">
+      <w:start w:val="1"/>
+      <w:numFmt w:val="bullet"/>
+      <w:lvlText w:val="○"/>
+      <w:lvlJc w:val="left"/>
+      <w:pPr>
+        <w:ind w:left="3600" w:hanging="360"/>
+      </w:pPr>
+      <w:rPr>
+        <w:u w:val="none"/>
+      </w:rPr>
+    </w:lvl>
+    <w:lvl w:ilvl="5">
+      <w:start w:val="1"/>
+      <w:numFmt w:val="bullet"/>
+      <w:lvlText w:val="■"/>
+      <w:lvlJc w:val="left"/>
+      <w:pPr>
+        <w:ind w:left="4320" w:hanging="360"/>
+      </w:pPr>
+      <w:rPr>
+        <w:u w:val="none"/>
+      </w:rPr>
+    </w:lvl>
+    <w:lvl w:ilvl="6">
+      <w:start w:val="1"/>
+      <w:numFmt w:val="bullet"/>
+      <w:lvlText w:val="●"/>
+      <w:lvlJc w:val="left"/>
+      <w:pPr>
+        <w:ind w:left="5040" w:hanging="360"/>
+      </w:pPr>
+      <w:rPr>
+        <w:u w:val="none"/>
+      </w:rPr>
+    </w:lvl>
+    <w:lvl w:ilvl="7">
+      <w:start w:val="1"/>
+      <w:numFmt w:val="bullet"/>
+      <w:lvlText w:val="○"/>
+      <w:lvlJc w:val="left"/>
+      <w:pPr>
+        <w:ind w:left="5760" w:hanging="360"/>
+      </w:pPr>
+      <w:rPr>
+        <w:u w:val="none"/>
+      </w:rPr>
+    </w:lvl>
+    <w:lvl w:ilvl="8">
+      <w:start w:val="1"/>
+      <w:numFmt w:val="bullet"/>
+      <w:lvlText w:val="■"/>
+      <w:lvlJc w:val="left"/>
+      <w:pPr>
+        <w:ind w:left="6480" w:hanging="360"/>
+      </w:pPr>
+      <w:rPr>
+        <w:u w:val="none"/>
+      </w:rPr>
+    </w:lvl>
+  </w:abstractNum>
+  <w:abstractNum w:abstractNumId="5">
     <w:lvl w:ilvl="0">
       <w:start w:val="1"/>
       <w:numFmt w:val="decimal"/>
@@ -2915,7 +4917,7 @@
       </w:rPr>
     </w:lvl>
   </w:abstractNum>
-  <w:abstractNum w:abstractNumId="3">
+  <w:abstractNum w:abstractNumId="6">
     <w:lvl w:ilvl="0">
       <w:start w:val="1"/>
       <w:numFmt w:val="decimal"/>
@@ -3025,117 +5027,7 @@
       </w:rPr>
     </w:lvl>
   </w:abstractNum>
-  <w:abstractNum w:abstractNumId="4">
-    <w:lvl w:ilvl="0">
-      <w:start w:val="1"/>
-      <w:numFmt w:val="decimal"/>
-      <w:lvlText w:val="%1."/>
-      <w:lvlJc w:val="left"/>
-      <w:pPr>
-        <w:ind w:left="720" w:hanging="360"/>
-      </w:pPr>
-      <w:rPr>
-        <w:u w:val="none"/>
-      </w:rPr>
-    </w:lvl>
-    <w:lvl w:ilvl="1">
-      <w:start w:val="1"/>
-      <w:numFmt w:val="lowerLetter"/>
-      <w:lvlText w:val="%2."/>
-      <w:lvlJc w:val="left"/>
-      <w:pPr>
-        <w:ind w:left="1440" w:hanging="360"/>
-      </w:pPr>
-      <w:rPr>
-        <w:u w:val="none"/>
-      </w:rPr>
-    </w:lvl>
-    <w:lvl w:ilvl="2">
-      <w:start w:val="1"/>
-      <w:numFmt w:val="lowerRoman"/>
-      <w:lvlText w:val="%3."/>
-      <w:lvlJc w:val="right"/>
-      <w:pPr>
-        <w:ind w:left="2160" w:hanging="360"/>
-      </w:pPr>
-      <w:rPr>
-        <w:u w:val="none"/>
-      </w:rPr>
-    </w:lvl>
-    <w:lvl w:ilvl="3">
-      <w:start w:val="1"/>
-      <w:numFmt w:val="decimal"/>
-      <w:lvlText w:val="%4."/>
-      <w:lvlJc w:val="left"/>
-      <w:pPr>
-        <w:ind w:left="2880" w:hanging="360"/>
-      </w:pPr>
-      <w:rPr>
-        <w:u w:val="none"/>
-      </w:rPr>
-    </w:lvl>
-    <w:lvl w:ilvl="4">
-      <w:start w:val="1"/>
-      <w:numFmt w:val="lowerLetter"/>
-      <w:lvlText w:val="%5."/>
-      <w:lvlJc w:val="left"/>
-      <w:pPr>
-        <w:ind w:left="3600" w:hanging="360"/>
-      </w:pPr>
-      <w:rPr>
-        <w:u w:val="none"/>
-      </w:rPr>
-    </w:lvl>
-    <w:lvl w:ilvl="5">
-      <w:start w:val="1"/>
-      <w:numFmt w:val="lowerRoman"/>
-      <w:lvlText w:val="%6."/>
-      <w:lvlJc w:val="right"/>
-      <w:pPr>
-        <w:ind w:left="4320" w:hanging="360"/>
-      </w:pPr>
-      <w:rPr>
-        <w:u w:val="none"/>
-      </w:rPr>
-    </w:lvl>
-    <w:lvl w:ilvl="6">
-      <w:start w:val="1"/>
-      <w:numFmt w:val="decimal"/>
-      <w:lvlText w:val="%7."/>
-      <w:lvlJc w:val="left"/>
-      <w:pPr>
-        <w:ind w:left="5040" w:hanging="360"/>
-      </w:pPr>
-      <w:rPr>
-        <w:u w:val="none"/>
-      </w:rPr>
-    </w:lvl>
-    <w:lvl w:ilvl="7">
-      <w:start w:val="1"/>
-      <w:numFmt w:val="lowerLetter"/>
-      <w:lvlText w:val="%8."/>
-      <w:lvlJc w:val="left"/>
-      <w:pPr>
-        <w:ind w:left="5760" w:hanging="360"/>
-      </w:pPr>
-      <w:rPr>
-        <w:u w:val="none"/>
-      </w:rPr>
-    </w:lvl>
-    <w:lvl w:ilvl="8">
-      <w:start w:val="1"/>
-      <w:numFmt w:val="lowerRoman"/>
-      <w:lvlText w:val="%9."/>
-      <w:lvlJc w:val="right"/>
-      <w:pPr>
-        <w:ind w:left="6480" w:hanging="360"/>
-      </w:pPr>
-      <w:rPr>
-        <w:u w:val="none"/>
-      </w:rPr>
-    </w:lvl>
-  </w:abstractNum>
-  <w:abstractNum w:abstractNumId="5">
+  <w:abstractNum w:abstractNumId="7">
     <w:lvl w:ilvl="0">
       <w:start w:val="1"/>
       <w:numFmt w:val="bullet"/>
@@ -3245,7 +5137,7 @@
       </w:rPr>
     </w:lvl>
   </w:abstractNum>
-  <w:abstractNum w:abstractNumId="6">
+  <w:abstractNum w:abstractNumId="8">
     <w:lvl w:ilvl="0">
       <w:start w:val="1"/>
       <w:numFmt w:val="bullet"/>
@@ -3346,6 +5238,116 @@
       <w:start w:val="1"/>
       <w:numFmt w:val="bullet"/>
       <w:lvlText w:val="■"/>
+      <w:lvlJc w:val="left"/>
+      <w:pPr>
+        <w:ind w:left="6480" w:hanging="360"/>
+      </w:pPr>
+      <w:rPr>
+        <w:u w:val="none"/>
+      </w:rPr>
+    </w:lvl>
+  </w:abstractNum>
+  <w:abstractNum w:abstractNumId="9">
+    <w:lvl w:ilvl="0">
+      <w:start w:val="1"/>
+      <w:numFmt w:val="lowerLetter"/>
+      <w:lvlText w:val="%1."/>
+      <w:lvlJc w:val="left"/>
+      <w:pPr>
+        <w:ind w:left="720" w:hanging="360"/>
+      </w:pPr>
+      <w:rPr>
+        <w:u w:val="none"/>
+      </w:rPr>
+    </w:lvl>
+    <w:lvl w:ilvl="1">
+      <w:start w:val="1"/>
+      <w:numFmt w:val="lowerRoman"/>
+      <w:lvlText w:val="%2."/>
+      <w:lvlJc w:val="right"/>
+      <w:pPr>
+        <w:ind w:left="1440" w:hanging="360"/>
+      </w:pPr>
+      <w:rPr>
+        <w:u w:val="none"/>
+      </w:rPr>
+    </w:lvl>
+    <w:lvl w:ilvl="2">
+      <w:start w:val="1"/>
+      <w:numFmt w:val="decimal"/>
+      <w:lvlText w:val="%3."/>
+      <w:lvlJc w:val="left"/>
+      <w:pPr>
+        <w:ind w:left="2160" w:hanging="360"/>
+      </w:pPr>
+      <w:rPr>
+        <w:u w:val="none"/>
+      </w:rPr>
+    </w:lvl>
+    <w:lvl w:ilvl="3">
+      <w:start w:val="1"/>
+      <w:numFmt w:val="lowerLetter"/>
+      <w:lvlText w:val="%4."/>
+      <w:lvlJc w:val="left"/>
+      <w:pPr>
+        <w:ind w:left="2880" w:hanging="360"/>
+      </w:pPr>
+      <w:rPr>
+        <w:u w:val="none"/>
+      </w:rPr>
+    </w:lvl>
+    <w:lvl w:ilvl="4">
+      <w:start w:val="1"/>
+      <w:numFmt w:val="lowerRoman"/>
+      <w:lvlText w:val="%5."/>
+      <w:lvlJc w:val="right"/>
+      <w:pPr>
+        <w:ind w:left="3600" w:hanging="360"/>
+      </w:pPr>
+      <w:rPr>
+        <w:u w:val="none"/>
+      </w:rPr>
+    </w:lvl>
+    <w:lvl w:ilvl="5">
+      <w:start w:val="1"/>
+      <w:numFmt w:val="decimal"/>
+      <w:lvlText w:val="%6."/>
+      <w:lvlJc w:val="left"/>
+      <w:pPr>
+        <w:ind w:left="4320" w:hanging="360"/>
+      </w:pPr>
+      <w:rPr>
+        <w:u w:val="none"/>
+      </w:rPr>
+    </w:lvl>
+    <w:lvl w:ilvl="6">
+      <w:start w:val="1"/>
+      <w:numFmt w:val="lowerLetter"/>
+      <w:lvlText w:val="%7."/>
+      <w:lvlJc w:val="left"/>
+      <w:pPr>
+        <w:ind w:left="5040" w:hanging="360"/>
+      </w:pPr>
+      <w:rPr>
+        <w:u w:val="none"/>
+      </w:rPr>
+    </w:lvl>
+    <w:lvl w:ilvl="7">
+      <w:start w:val="1"/>
+      <w:numFmt w:val="lowerRoman"/>
+      <w:lvlText w:val="%8."/>
+      <w:lvlJc w:val="right"/>
+      <w:pPr>
+        <w:ind w:left="5760" w:hanging="360"/>
+      </w:pPr>
+      <w:rPr>
+        <w:u w:val="none"/>
+      </w:rPr>
+    </w:lvl>
+    <w:lvl w:ilvl="8">
+      <w:start w:val="1"/>
+      <w:numFmt w:val="decimal"/>
+      <w:lvlText w:val="%9."/>
       <w:lvlJc w:val="left"/>
       <w:pPr>
         <w:ind w:left="6480" w:hanging="360"/>
@@ -3372,6 +5374,15 @@
   </w:num>
   <w:num w:numId="6">
     <w:abstractNumId w:val="6"/>
+  </w:num>
+  <w:num w:numId="7">
+    <w:abstractNumId w:val="7"/>
+  </w:num>
+  <w:num w:numId="8">
+    <w:abstractNumId w:val="8"/>
+  </w:num>
+  <w:num w:numId="9">
+    <w:abstractNumId w:val="9"/>
   </w:num>
 </w:numbering>
 </file>
@@ -3546,7 +5557,12 @@
     <w:tblPr>
       <w:tblStyleRowBandSize w:val="1"/>
       <w:tblStyleColBandSize w:val="1"/>
-      <w:tblCellMar/>
+      <w:tblCellMar>
+        <w:top w:w="100.0" w:type="dxa"/>
+        <w:left w:w="100.0" w:type="dxa"/>
+        <w:bottom w:w="100.0" w:type="dxa"/>
+        <w:right w:w="100.0" w:type="dxa"/>
+      </w:tblCellMar>
     </w:tblPr>
   </w:style>
 </w:styles>
@@ -3870,4 +5886,19 @@
   </a:objectDefaults>
   <a:extraClrSchemeLst/>
 </a:theme>
+</file>
+
+<file path=customXML/item1.xml><?xml version="1.0" encoding="utf-8"?>
+<go:gDocsCustomXmlDataStorage xmlns:go="http://customooxmlschemas.google.com/" xmlns:r="http://schemas.openxmlformats.org/officeDocument/2006/relationships" uri="GoogleDocsCustomDataVersion2">
+  <go:docsCustomData xmlns:go="http://customooxmlschemas.google.com/" roundtripDataSignature="AMtx7mhBuz2CZZWA7ZVyGLtOC/9F3aXyfg==">CgMxLjAaHQoBMBIYChYIB0ISEhBBcmlhbCBVbmljb2RlIE1TGiQKATESHwodCAdCGQoFQXJpbW8SEEFyaWFsIFVuaWNvZGUgTVMaJAoBMhIfCh0IB0IZCgVBcmltbxIQQXJpYWwgVW5pY29kZSBNUxokCgEzEh8KHQgHQhkKBUFyaW1vEhBBcmlhbCBVbmljb2RlIE1TGiQKATQSHwodCAdCGQoFQXJpbW8SEEFyaWFsIFVuaWNvZGUgTVMaJAoBNRIfCh0IB0IZCgVBcmltbxIQQXJpYWwgVW5pY29kZSBNUxokCgE2Eh8KHQgHQhkKBUFyaW1vEhBBcmlhbCBVbmljb2RlIE1TMg5oLmJ4c3d1ZDdpOTR3ZDgAciExSktoMnQzck5jRzhhZFozZUozZlRIN2hfNG9qcWFVTUc=</go:docsCustomData>
+</go:gDocsCustomXmlDataStorage>
+</file>
+
+<file path=customXML/itemProps1.xml><?xml version="1.0" encoding="utf-8"?>
+<ds:datastoreItem xmlns:ds="http://schemas.openxmlformats.org/officeDocument/2006/customXml" ds:itemID="{11111111-1234-1234-1234-123412341234}">
+  <ds:schemaRefs>
+    <ds:schemaRef ds:uri="http://schemas.openxmlformats.org/officeDocument/2006/relationships"/>
+    <ds:schemaRef ds:uri="http://customooxmlschemas.google.com/"/>
+  </ds:schemaRefs>
+</ds:datastoreItem>
 </file>
</xml_diff>